<commit_message>
updated rmd files for heatmap and IR data analysis
</commit_message>
<xml_diff>
--- a/LabNotes.docx
+++ b/LabNotes.docx
@@ -1498,7 +1498,23 @@
           <w:sz w:val="16"/>
           <w:szCs w:val="16"/>
         </w:rPr>
-        <w:t xml:space="preserve"> added genome, scraped links off of flow:</w:t>
+        <w:t xml:space="preserve"> added genome, scraped links </w:t>
+      </w:r>
+      <w:proofErr w:type="gramStart"/>
+      <w:r>
+        <w:rPr>
+          <w:sz w:val="16"/>
+          <w:szCs w:val="16"/>
+        </w:rPr>
+        <w:t>off of</w:t>
+      </w:r>
+      <w:proofErr w:type="gramEnd"/>
+      <w:r>
+        <w:rPr>
+          <w:sz w:val="16"/>
+          <w:szCs w:val="16"/>
+        </w:rPr>
+        <w:t xml:space="preserve"> flow:</w:t>
       </w:r>
     </w:p>
     <w:p>
@@ -1582,6 +1598,7 @@
         <w:t>a.href</w:t>
       </w:r>
       <w:proofErr w:type="spellEnd"/>
+      <w:proofErr w:type="gramStart"/>
       <w:r>
         <w:rPr>
           <w:sz w:val="16"/>
@@ -1589,6 +1606,7 @@
         </w:rPr>
         <w:t>);</w:t>
       </w:r>
+      <w:proofErr w:type="gramEnd"/>
     </w:p>
     <w:p>
       <w:pPr>
@@ -1619,8 +1637,17 @@
           <w:sz w:val="16"/>
           <w:szCs w:val="16"/>
         </w:rPr>
-        <w:t>('\n'));</w:t>
-      </w:r>
+        <w:t>('\n')</w:t>
+      </w:r>
+      <w:proofErr w:type="gramStart"/>
+      <w:r>
+        <w:rPr>
+          <w:sz w:val="16"/>
+          <w:szCs w:val="16"/>
+        </w:rPr>
+        <w:t>);</w:t>
+      </w:r>
+      <w:proofErr w:type="gramEnd"/>
     </w:p>
     <w:p>
       <w:pPr>
@@ -1651,8 +1678,17 @@
           <w:sz w:val="16"/>
           <w:szCs w:val="16"/>
         </w:rPr>
-        <w:t>}`);</w:t>
-      </w:r>
+        <w:t>}`</w:t>
+      </w:r>
+      <w:proofErr w:type="gramStart"/>
+      <w:r>
+        <w:rPr>
+          <w:sz w:val="16"/>
+          <w:szCs w:val="16"/>
+        </w:rPr>
+        <w:t>);</w:t>
+      </w:r>
+      <w:proofErr w:type="gramEnd"/>
     </w:p>
     <w:p>
       <w:pPr>
@@ -3311,7 +3347,23 @@
           <w:sz w:val="16"/>
           <w:szCs w:val="16"/>
         </w:rPr>
-        <w:t xml:space="preserve">Input source based parameter validation – two possible sample sheets with </w:t>
+        <w:t xml:space="preserve">Input </w:t>
+      </w:r>
+      <w:proofErr w:type="gramStart"/>
+      <w:r>
+        <w:rPr>
+          <w:sz w:val="16"/>
+          <w:szCs w:val="16"/>
+        </w:rPr>
+        <w:t>source based</w:t>
+      </w:r>
+      <w:proofErr w:type="gramEnd"/>
+      <w:r>
+        <w:rPr>
+          <w:sz w:val="16"/>
+          <w:szCs w:val="16"/>
+        </w:rPr>
+        <w:t xml:space="preserve"> parameter validation – two possible sample sheets with </w:t>
       </w:r>
       <w:proofErr w:type="spellStart"/>
       <w:r>
@@ -8972,6 +9024,7 @@
           <w:szCs w:val="16"/>
         </w:rPr>
       </w:pPr>
+      <w:proofErr w:type="gramStart"/>
       <w:r>
         <w:rPr>
           <w:b/>
@@ -8980,7 +9033,18 @@
           <w:szCs w:val="16"/>
           <w:u w:val="single"/>
         </w:rPr>
-        <w:t>May, 13, 2025</w:t>
+        <w:t>May,</w:t>
+      </w:r>
+      <w:proofErr w:type="gramEnd"/>
+      <w:r>
+        <w:rPr>
+          <w:b/>
+          <w:bCs/>
+          <w:sz w:val="16"/>
+          <w:szCs w:val="16"/>
+          <w:u w:val="single"/>
+        </w:rPr>
+        <w:t xml:space="preserve"> 13, 2025</w:t>
       </w:r>
       <w:r>
         <w:rPr>
@@ -10932,7 +10996,23 @@
           <w:sz w:val="16"/>
           <w:szCs w:val="16"/>
         </w:rPr>
-        <w:t xml:space="preserve"> first priority connect with Klara – issues due to ?</w:t>
+        <w:t xml:space="preserve"> </w:t>
+      </w:r>
+      <w:proofErr w:type="gramStart"/>
+      <w:r>
+        <w:rPr>
+          <w:sz w:val="16"/>
+          <w:szCs w:val="16"/>
+        </w:rPr>
+        <w:t>first priority</w:t>
+      </w:r>
+      <w:proofErr w:type="gramEnd"/>
+      <w:r>
+        <w:rPr>
+          <w:sz w:val="16"/>
+          <w:szCs w:val="16"/>
+        </w:rPr>
+        <w:t xml:space="preserve"> connect with Klara – issues due to ?</w:t>
       </w:r>
     </w:p>
     <w:p>
@@ -11401,24 +11481,42 @@
           <w:sz w:val="16"/>
           <w:szCs w:val="16"/>
         </w:rPr>
-        <w:t xml:space="preserve">  end = $3 + 50;</w:t>
-      </w:r>
-    </w:p>
-    <w:p>
-      <w:pPr>
-        <w:spacing w:after="0" w:line="240" w:lineRule="auto"/>
-        <w:rPr>
-          <w:sz w:val="16"/>
-          <w:szCs w:val="16"/>
-        </w:rPr>
-      </w:pPr>
-      <w:r>
-        <w:rPr>
-          <w:sz w:val="16"/>
-          <w:szCs w:val="16"/>
-        </w:rPr>
-        <w:t xml:space="preserve">  print $1 "\t" start "\t" end "\t" $4 "\t" $5 "\t" $6;</w:t>
-      </w:r>
+        <w:t xml:space="preserve">  end = $3 + </w:t>
+      </w:r>
+      <w:proofErr w:type="gramStart"/>
+      <w:r>
+        <w:rPr>
+          <w:sz w:val="16"/>
+          <w:szCs w:val="16"/>
+        </w:rPr>
+        <w:t>50;</w:t>
+      </w:r>
+      <w:proofErr w:type="gramEnd"/>
+    </w:p>
+    <w:p>
+      <w:pPr>
+        <w:spacing w:after="0" w:line="240" w:lineRule="auto"/>
+        <w:rPr>
+          <w:sz w:val="16"/>
+          <w:szCs w:val="16"/>
+        </w:rPr>
+      </w:pPr>
+      <w:r>
+        <w:rPr>
+          <w:sz w:val="16"/>
+          <w:szCs w:val="16"/>
+        </w:rPr>
+        <w:t xml:space="preserve">  print $1 "\t" start "\t" end "\t" $4 "\t" $5 "\t" </w:t>
+      </w:r>
+      <w:proofErr w:type="gramStart"/>
+      <w:r>
+        <w:rPr>
+          <w:sz w:val="16"/>
+          <w:szCs w:val="16"/>
+        </w:rPr>
+        <w:t>$6;</w:t>
+      </w:r>
+      <w:proofErr w:type="gramEnd"/>
     </w:p>
     <w:p>
       <w:pPr>
@@ -11671,167 +11769,343 @@
           <w:sz w:val="16"/>
           <w:szCs w:val="16"/>
         </w:rPr>
-        <w:t>&gt;HNRNPH1::chr5:179621347-179623086(-)</w:t>
-      </w:r>
-    </w:p>
-    <w:p>
-      <w:pPr>
-        <w:spacing w:after="0" w:line="240" w:lineRule="auto"/>
-        <w:rPr>
-          <w:sz w:val="16"/>
-          <w:szCs w:val="16"/>
-        </w:rPr>
-      </w:pPr>
-      <w:r>
-        <w:rPr>
-          <w:sz w:val="16"/>
-          <w:szCs w:val="16"/>
-        </w:rPr>
-        <w:t>&gt;HNRNPH1::chr5:179620985-179621291(-)</w:t>
-      </w:r>
-    </w:p>
-    <w:p>
-      <w:pPr>
-        <w:spacing w:after="0" w:line="240" w:lineRule="auto"/>
-        <w:rPr>
-          <w:sz w:val="16"/>
-          <w:szCs w:val="16"/>
-        </w:rPr>
-      </w:pPr>
-      <w:r>
-        <w:rPr>
-          <w:sz w:val="16"/>
-          <w:szCs w:val="16"/>
-        </w:rPr>
-        <w:t>&gt;HNRNPH1::chr5:179619357-179620941(-)</w:t>
-      </w:r>
-    </w:p>
-    <w:p>
-      <w:pPr>
-        <w:spacing w:after="0" w:line="240" w:lineRule="auto"/>
-        <w:rPr>
-          <w:sz w:val="16"/>
-          <w:szCs w:val="16"/>
-        </w:rPr>
-      </w:pPr>
-      <w:r>
-        <w:rPr>
-          <w:sz w:val="16"/>
-          <w:szCs w:val="16"/>
-        </w:rPr>
-        <w:t>&gt;HNRNPH1::chr5:179618273-179619318(-)</w:t>
-      </w:r>
-    </w:p>
-    <w:p>
-      <w:pPr>
-        <w:spacing w:after="0" w:line="240" w:lineRule="auto"/>
-        <w:rPr>
-          <w:sz w:val="16"/>
-          <w:szCs w:val="16"/>
-        </w:rPr>
-      </w:pPr>
-      <w:r>
-        <w:rPr>
-          <w:sz w:val="16"/>
-          <w:szCs w:val="16"/>
-        </w:rPr>
-        <w:t>&gt;HNRNPH1::chr5:179618010-179618194(-)</w:t>
-      </w:r>
-    </w:p>
-    <w:p>
-      <w:pPr>
-        <w:spacing w:after="0" w:line="240" w:lineRule="auto"/>
-        <w:rPr>
-          <w:sz w:val="16"/>
-          <w:szCs w:val="16"/>
-        </w:rPr>
-      </w:pPr>
-      <w:r>
-        <w:rPr>
-          <w:sz w:val="16"/>
-          <w:szCs w:val="16"/>
-        </w:rPr>
-        <w:t>&gt;HNRNPH1::chr5:179617882-179618038(-)</w:t>
-      </w:r>
-    </w:p>
-    <w:p>
-      <w:pPr>
-        <w:spacing w:after="0" w:line="240" w:lineRule="auto"/>
-        <w:rPr>
-          <w:sz w:val="16"/>
-          <w:szCs w:val="16"/>
-        </w:rPr>
-      </w:pPr>
-      <w:r>
-        <w:rPr>
-          <w:sz w:val="16"/>
-          <w:szCs w:val="16"/>
-        </w:rPr>
-        <w:t>&gt;HNRNPH1::chr5:179617599-179617848(-)</w:t>
-      </w:r>
-    </w:p>
-    <w:p>
-      <w:pPr>
-        <w:spacing w:after="0" w:line="240" w:lineRule="auto"/>
-        <w:rPr>
-          <w:sz w:val="16"/>
-          <w:szCs w:val="16"/>
-        </w:rPr>
-      </w:pPr>
-      <w:r>
-        <w:rPr>
-          <w:sz w:val="16"/>
-          <w:szCs w:val="16"/>
-        </w:rPr>
-        <w:t>&gt;HNRNPH1::chr5:179616908-179617100(-)</w:t>
-      </w:r>
-    </w:p>
-    <w:p>
-      <w:pPr>
-        <w:spacing w:after="0" w:line="240" w:lineRule="auto"/>
-        <w:rPr>
-          <w:sz w:val="16"/>
-          <w:szCs w:val="16"/>
-        </w:rPr>
-      </w:pPr>
-      <w:r>
-        <w:rPr>
-          <w:sz w:val="16"/>
-          <w:szCs w:val="16"/>
-        </w:rPr>
-        <w:t>&gt;HNRNPH1::chr5:179616168-179616918(-)</w:t>
-      </w:r>
-    </w:p>
-    <w:p>
-      <w:pPr>
-        <w:spacing w:after="0" w:line="240" w:lineRule="auto"/>
-        <w:rPr>
-          <w:sz w:val="16"/>
-          <w:szCs w:val="16"/>
-        </w:rPr>
-      </w:pPr>
-      <w:r>
-        <w:rPr>
-          <w:sz w:val="16"/>
-          <w:szCs w:val="16"/>
-        </w:rPr>
-        <w:t>&gt;HNRNPH1::chr5:179615545-179616175(-)</w:t>
-      </w:r>
-    </w:p>
-    <w:p>
-      <w:pPr>
-        <w:spacing w:after="0" w:line="240" w:lineRule="auto"/>
-        <w:rPr>
-          <w:sz w:val="16"/>
-          <w:szCs w:val="16"/>
-        </w:rPr>
-      </w:pPr>
-      <w:r>
-        <w:rPr>
-          <w:sz w:val="16"/>
-          <w:szCs w:val="16"/>
-        </w:rPr>
-        <w:t>&gt;HNRNPH1::chr5:179614909-179615595(-)</w:t>
+        <w:t>&gt;HNRNPH</w:t>
+      </w:r>
+      <w:proofErr w:type="gramStart"/>
+      <w:r>
+        <w:rPr>
+          <w:sz w:val="16"/>
+          <w:szCs w:val="16"/>
+        </w:rPr>
+        <w:t>1::</w:t>
+      </w:r>
+      <w:proofErr w:type="gramEnd"/>
+      <w:r>
+        <w:rPr>
+          <w:sz w:val="16"/>
+          <w:szCs w:val="16"/>
+        </w:rPr>
+        <w:t>chr5:179621347-179623086(-)</w:t>
+      </w:r>
+    </w:p>
+    <w:p>
+      <w:pPr>
+        <w:spacing w:after="0" w:line="240" w:lineRule="auto"/>
+        <w:rPr>
+          <w:sz w:val="16"/>
+          <w:szCs w:val="16"/>
+        </w:rPr>
+      </w:pPr>
+      <w:r>
+        <w:rPr>
+          <w:sz w:val="16"/>
+          <w:szCs w:val="16"/>
+        </w:rPr>
+        <w:t>&gt;HNRNPH</w:t>
+      </w:r>
+      <w:proofErr w:type="gramStart"/>
+      <w:r>
+        <w:rPr>
+          <w:sz w:val="16"/>
+          <w:szCs w:val="16"/>
+        </w:rPr>
+        <w:t>1::</w:t>
+      </w:r>
+      <w:proofErr w:type="gramEnd"/>
+      <w:r>
+        <w:rPr>
+          <w:sz w:val="16"/>
+          <w:szCs w:val="16"/>
+        </w:rPr>
+        <w:t>chr5:179620985-179621291(-)</w:t>
+      </w:r>
+    </w:p>
+    <w:p>
+      <w:pPr>
+        <w:spacing w:after="0" w:line="240" w:lineRule="auto"/>
+        <w:rPr>
+          <w:sz w:val="16"/>
+          <w:szCs w:val="16"/>
+        </w:rPr>
+      </w:pPr>
+      <w:r>
+        <w:rPr>
+          <w:sz w:val="16"/>
+          <w:szCs w:val="16"/>
+        </w:rPr>
+        <w:t>&gt;HNRNPH</w:t>
+      </w:r>
+      <w:proofErr w:type="gramStart"/>
+      <w:r>
+        <w:rPr>
+          <w:sz w:val="16"/>
+          <w:szCs w:val="16"/>
+        </w:rPr>
+        <w:t>1::</w:t>
+      </w:r>
+      <w:proofErr w:type="gramEnd"/>
+      <w:r>
+        <w:rPr>
+          <w:sz w:val="16"/>
+          <w:szCs w:val="16"/>
+        </w:rPr>
+        <w:t>chr5:179619357-179620941(-)</w:t>
+      </w:r>
+    </w:p>
+    <w:p>
+      <w:pPr>
+        <w:spacing w:after="0" w:line="240" w:lineRule="auto"/>
+        <w:rPr>
+          <w:sz w:val="16"/>
+          <w:szCs w:val="16"/>
+        </w:rPr>
+      </w:pPr>
+      <w:r>
+        <w:rPr>
+          <w:sz w:val="16"/>
+          <w:szCs w:val="16"/>
+        </w:rPr>
+        <w:t>&gt;HNRNPH</w:t>
+      </w:r>
+      <w:proofErr w:type="gramStart"/>
+      <w:r>
+        <w:rPr>
+          <w:sz w:val="16"/>
+          <w:szCs w:val="16"/>
+        </w:rPr>
+        <w:t>1::</w:t>
+      </w:r>
+      <w:proofErr w:type="gramEnd"/>
+      <w:r>
+        <w:rPr>
+          <w:sz w:val="16"/>
+          <w:szCs w:val="16"/>
+        </w:rPr>
+        <w:t>chr5:179618273-179619318(-)</w:t>
+      </w:r>
+    </w:p>
+    <w:p>
+      <w:pPr>
+        <w:spacing w:after="0" w:line="240" w:lineRule="auto"/>
+        <w:rPr>
+          <w:sz w:val="16"/>
+          <w:szCs w:val="16"/>
+        </w:rPr>
+      </w:pPr>
+      <w:r>
+        <w:rPr>
+          <w:sz w:val="16"/>
+          <w:szCs w:val="16"/>
+        </w:rPr>
+        <w:t>&gt;HNRNPH</w:t>
+      </w:r>
+      <w:proofErr w:type="gramStart"/>
+      <w:r>
+        <w:rPr>
+          <w:sz w:val="16"/>
+          <w:szCs w:val="16"/>
+        </w:rPr>
+        <w:t>1::</w:t>
+      </w:r>
+      <w:proofErr w:type="gramEnd"/>
+      <w:r>
+        <w:rPr>
+          <w:sz w:val="16"/>
+          <w:szCs w:val="16"/>
+        </w:rPr>
+        <w:t>chr5:179618010-179618194(-)</w:t>
+      </w:r>
+    </w:p>
+    <w:p>
+      <w:pPr>
+        <w:spacing w:after="0" w:line="240" w:lineRule="auto"/>
+        <w:rPr>
+          <w:sz w:val="16"/>
+          <w:szCs w:val="16"/>
+        </w:rPr>
+      </w:pPr>
+      <w:r>
+        <w:rPr>
+          <w:sz w:val="16"/>
+          <w:szCs w:val="16"/>
+        </w:rPr>
+        <w:t>&gt;HNRNPH</w:t>
+      </w:r>
+      <w:proofErr w:type="gramStart"/>
+      <w:r>
+        <w:rPr>
+          <w:sz w:val="16"/>
+          <w:szCs w:val="16"/>
+        </w:rPr>
+        <w:t>1::</w:t>
+      </w:r>
+      <w:proofErr w:type="gramEnd"/>
+      <w:r>
+        <w:rPr>
+          <w:sz w:val="16"/>
+          <w:szCs w:val="16"/>
+        </w:rPr>
+        <w:t>chr5:179617882-179618038(-)</w:t>
+      </w:r>
+    </w:p>
+    <w:p>
+      <w:pPr>
+        <w:spacing w:after="0" w:line="240" w:lineRule="auto"/>
+        <w:rPr>
+          <w:sz w:val="16"/>
+          <w:szCs w:val="16"/>
+        </w:rPr>
+      </w:pPr>
+      <w:r>
+        <w:rPr>
+          <w:sz w:val="16"/>
+          <w:szCs w:val="16"/>
+        </w:rPr>
+        <w:t>&gt;HNRNPH</w:t>
+      </w:r>
+      <w:proofErr w:type="gramStart"/>
+      <w:r>
+        <w:rPr>
+          <w:sz w:val="16"/>
+          <w:szCs w:val="16"/>
+        </w:rPr>
+        <w:t>1::</w:t>
+      </w:r>
+      <w:proofErr w:type="gramEnd"/>
+      <w:r>
+        <w:rPr>
+          <w:sz w:val="16"/>
+          <w:szCs w:val="16"/>
+        </w:rPr>
+        <w:t>chr5:179617599-179617848(-)</w:t>
+      </w:r>
+    </w:p>
+    <w:p>
+      <w:pPr>
+        <w:spacing w:after="0" w:line="240" w:lineRule="auto"/>
+        <w:rPr>
+          <w:sz w:val="16"/>
+          <w:szCs w:val="16"/>
+        </w:rPr>
+      </w:pPr>
+      <w:r>
+        <w:rPr>
+          <w:sz w:val="16"/>
+          <w:szCs w:val="16"/>
+        </w:rPr>
+        <w:t>&gt;HNRNPH</w:t>
+      </w:r>
+      <w:proofErr w:type="gramStart"/>
+      <w:r>
+        <w:rPr>
+          <w:sz w:val="16"/>
+          <w:szCs w:val="16"/>
+        </w:rPr>
+        <w:t>1::</w:t>
+      </w:r>
+      <w:proofErr w:type="gramEnd"/>
+      <w:r>
+        <w:rPr>
+          <w:sz w:val="16"/>
+          <w:szCs w:val="16"/>
+        </w:rPr>
+        <w:t>chr5:179616908-179617100(-)</w:t>
+      </w:r>
+    </w:p>
+    <w:p>
+      <w:pPr>
+        <w:spacing w:after="0" w:line="240" w:lineRule="auto"/>
+        <w:rPr>
+          <w:sz w:val="16"/>
+          <w:szCs w:val="16"/>
+        </w:rPr>
+      </w:pPr>
+      <w:r>
+        <w:rPr>
+          <w:sz w:val="16"/>
+          <w:szCs w:val="16"/>
+        </w:rPr>
+        <w:t>&gt;HNRNPH</w:t>
+      </w:r>
+      <w:proofErr w:type="gramStart"/>
+      <w:r>
+        <w:rPr>
+          <w:sz w:val="16"/>
+          <w:szCs w:val="16"/>
+        </w:rPr>
+        <w:t>1::</w:t>
+      </w:r>
+      <w:proofErr w:type="gramEnd"/>
+      <w:r>
+        <w:rPr>
+          <w:sz w:val="16"/>
+          <w:szCs w:val="16"/>
+        </w:rPr>
+        <w:t>chr5:179616168-179616918(-)</w:t>
+      </w:r>
+    </w:p>
+    <w:p>
+      <w:pPr>
+        <w:spacing w:after="0" w:line="240" w:lineRule="auto"/>
+        <w:rPr>
+          <w:sz w:val="16"/>
+          <w:szCs w:val="16"/>
+        </w:rPr>
+      </w:pPr>
+      <w:r>
+        <w:rPr>
+          <w:sz w:val="16"/>
+          <w:szCs w:val="16"/>
+        </w:rPr>
+        <w:t>&gt;HNRNPH</w:t>
+      </w:r>
+      <w:proofErr w:type="gramStart"/>
+      <w:r>
+        <w:rPr>
+          <w:sz w:val="16"/>
+          <w:szCs w:val="16"/>
+        </w:rPr>
+        <w:t>1::</w:t>
+      </w:r>
+      <w:proofErr w:type="gramEnd"/>
+      <w:r>
+        <w:rPr>
+          <w:sz w:val="16"/>
+          <w:szCs w:val="16"/>
+        </w:rPr>
+        <w:t>chr5:179615545-179616175(-)</w:t>
+      </w:r>
+    </w:p>
+    <w:p>
+      <w:pPr>
+        <w:spacing w:after="0" w:line="240" w:lineRule="auto"/>
+        <w:rPr>
+          <w:sz w:val="16"/>
+          <w:szCs w:val="16"/>
+        </w:rPr>
+      </w:pPr>
+      <w:r>
+        <w:rPr>
+          <w:sz w:val="16"/>
+          <w:szCs w:val="16"/>
+        </w:rPr>
+        <w:t>&gt;HNRNPH</w:t>
+      </w:r>
+      <w:proofErr w:type="gramStart"/>
+      <w:r>
+        <w:rPr>
+          <w:sz w:val="16"/>
+          <w:szCs w:val="16"/>
+        </w:rPr>
+        <w:t>1::</w:t>
+      </w:r>
+      <w:proofErr w:type="gramEnd"/>
+      <w:r>
+        <w:rPr>
+          <w:sz w:val="16"/>
+          <w:szCs w:val="16"/>
+        </w:rPr>
+        <w:t>chr5:179614909-179615595(-)</w:t>
       </w:r>
     </w:p>
     <w:p>
@@ -11879,7 +12153,23 @@
           <w:sz w:val="16"/>
           <w:szCs w:val="16"/>
         </w:rPr>
-        <w:t xml:space="preserve">$ grep HNRNPH1::chr5:179616908-179617100 -A 1 </w:t>
+        <w:t>$ grep HNRNPH</w:t>
+      </w:r>
+      <w:proofErr w:type="gramStart"/>
+      <w:r>
+        <w:rPr>
+          <w:sz w:val="16"/>
+          <w:szCs w:val="16"/>
+        </w:rPr>
+        <w:t>1::</w:t>
+      </w:r>
+      <w:proofErr w:type="gramEnd"/>
+      <w:r>
+        <w:rPr>
+          <w:sz w:val="16"/>
+          <w:szCs w:val="16"/>
+        </w:rPr>
+        <w:t xml:space="preserve">chr5:179616908-179617100 -A 1 </w:t>
       </w:r>
       <w:proofErr w:type="spellStart"/>
       <w:r>
@@ -11911,7 +12201,23 @@
           <w:sz w:val="16"/>
           <w:szCs w:val="16"/>
         </w:rPr>
-        <w:t>&gt;HNRNPH1::chr5:179616908-179617100(-)</w:t>
+        <w:t>&gt;HNRNPH</w:t>
+      </w:r>
+      <w:proofErr w:type="gramStart"/>
+      <w:r>
+        <w:rPr>
+          <w:sz w:val="16"/>
+          <w:szCs w:val="16"/>
+        </w:rPr>
+        <w:t>1::</w:t>
+      </w:r>
+      <w:proofErr w:type="gramEnd"/>
+      <w:r>
+        <w:rPr>
+          <w:sz w:val="16"/>
+          <w:szCs w:val="16"/>
+        </w:rPr>
+        <w:t>chr5:179616908-179617100(-)</w:t>
       </w:r>
     </w:p>
     <w:p>
@@ -13509,7 +13815,23 @@
           <w:sz w:val="16"/>
           <w:szCs w:val="16"/>
         </w:rPr>
-        <w:t xml:space="preserve"> is not None else None))</w:t>
+        <w:t xml:space="preserve"> is not </w:t>
+      </w:r>
+      <w:proofErr w:type="gramStart"/>
+      <w:r>
+        <w:rPr>
+          <w:sz w:val="16"/>
+          <w:szCs w:val="16"/>
+        </w:rPr>
+        <w:t>None</w:t>
+      </w:r>
+      <w:proofErr w:type="gramEnd"/>
+      <w:r>
+        <w:rPr>
+          <w:sz w:val="16"/>
+          <w:szCs w:val="16"/>
+        </w:rPr>
+        <w:t xml:space="preserve"> else None))</w:t>
       </w:r>
     </w:p>
     <w:p>
@@ -13956,7 +14278,7 @@
           <w:szCs w:val="16"/>
         </w:rPr>
         <w:drawing>
-          <wp:anchor distT="0" distB="0" distL="114300" distR="114300" simplePos="0" relativeHeight="251658240" behindDoc="1" locked="0" layoutInCell="1" allowOverlap="1" wp14:anchorId="279D7A5F" wp14:editId="08CCE865">
+          <wp:anchor distT="0" distB="0" distL="114300" distR="114300" simplePos="0" relativeHeight="251658240" behindDoc="1" locked="0" layoutInCell="1" allowOverlap="1" wp14:anchorId="279D7A5F" wp14:editId="36EDD308">
             <wp:simplePos x="0" y="0"/>
             <wp:positionH relativeFrom="column">
               <wp:posOffset>3615055</wp:posOffset>
@@ -15108,7 +15430,23 @@
           <w:sz w:val="16"/>
           <w:szCs w:val="16"/>
         </w:rPr>
-        <w:t xml:space="preserve">Troubleshooting context trimming, next step run all inference through </w:t>
+        <w:t xml:space="preserve">Troubleshooting context trimming, next step </w:t>
+      </w:r>
+      <w:proofErr w:type="gramStart"/>
+      <w:r>
+        <w:rPr>
+          <w:sz w:val="16"/>
+          <w:szCs w:val="16"/>
+        </w:rPr>
+        <w:t>run</w:t>
+      </w:r>
+      <w:proofErr w:type="gramEnd"/>
+      <w:r>
+        <w:rPr>
+          <w:sz w:val="16"/>
+          <w:szCs w:val="16"/>
+        </w:rPr>
+        <w:t xml:space="preserve"> all inference through </w:t>
       </w:r>
       <w:proofErr w:type="spellStart"/>
       <w:r>
@@ -15822,7 +16160,25 @@
           <w:sz w:val="16"/>
           <w:szCs w:val="16"/>
         </w:rPr>
-        <w:t>Created merged dataset and fixed heatmap inconsistencies, need to look into duplicates in the expression gene list</w:t>
+        <w:t xml:space="preserve">Created merged dataset and fixed heatmap inconsistencies, need to </w:t>
+      </w:r>
+      <w:proofErr w:type="gramStart"/>
+      <w:r>
+        <w:rPr>
+          <w:bCs/>
+          <w:sz w:val="16"/>
+          <w:szCs w:val="16"/>
+        </w:rPr>
+        <w:t>look into</w:t>
+      </w:r>
+      <w:proofErr w:type="gramEnd"/>
+      <w:r>
+        <w:rPr>
+          <w:bCs/>
+          <w:sz w:val="16"/>
+          <w:szCs w:val="16"/>
+        </w:rPr>
+        <w:t xml:space="preserve"> duplicates in the expression gene list</w:t>
       </w:r>
     </w:p>
     <w:p>
@@ -16899,7 +17255,25 @@
           <w:sz w:val="16"/>
           <w:szCs w:val="16"/>
         </w:rPr>
-        <w:t xml:space="preserve"> after. extract start coordinate from </w:t>
+        <w:t xml:space="preserve"> after. extract start </w:t>
+      </w:r>
+      <w:proofErr w:type="gramStart"/>
+      <w:r>
+        <w:rPr>
+          <w:bCs/>
+          <w:sz w:val="16"/>
+          <w:szCs w:val="16"/>
+        </w:rPr>
+        <w:t>coordinate</w:t>
+      </w:r>
+      <w:proofErr w:type="gramEnd"/>
+      <w:r>
+        <w:rPr>
+          <w:bCs/>
+          <w:sz w:val="16"/>
+          <w:szCs w:val="16"/>
+        </w:rPr>
+        <w:t xml:space="preserve"> from </w:t>
       </w:r>
       <w:proofErr w:type="spellStart"/>
       <w:r>
@@ -21125,7 +21499,25 @@
           <w:sz w:val="16"/>
           <w:szCs w:val="16"/>
         </w:rPr>
-        <w:t xml:space="preserve"> prediction bed conversion with HNRNPH1::chr5:179616908-179617100</w:t>
+        <w:t xml:space="preserve"> prediction bed conversion with HNRNPH</w:t>
+      </w:r>
+      <w:proofErr w:type="gramStart"/>
+      <w:r>
+        <w:rPr>
+          <w:bCs/>
+          <w:sz w:val="16"/>
+          <w:szCs w:val="16"/>
+        </w:rPr>
+        <w:t>1::</w:t>
+      </w:r>
+      <w:proofErr w:type="gramEnd"/>
+      <w:r>
+        <w:rPr>
+          <w:bCs/>
+          <w:sz w:val="16"/>
+          <w:szCs w:val="16"/>
+        </w:rPr>
+        <w:t>chr5:179616908-179617100</w:t>
       </w:r>
     </w:p>
     <w:p>
@@ -21151,7 +21543,25 @@
           <w:sz w:val="16"/>
           <w:szCs w:val="16"/>
         </w:rPr>
-        <w:t>HNRNPH1::chr5:179616908-179617100</w:t>
+        <w:t>HNRNPH</w:t>
+      </w:r>
+      <w:proofErr w:type="gramStart"/>
+      <w:r>
+        <w:rPr>
+          <w:bCs/>
+          <w:sz w:val="16"/>
+          <w:szCs w:val="16"/>
+        </w:rPr>
+        <w:t>1::</w:t>
+      </w:r>
+      <w:proofErr w:type="gramEnd"/>
+      <w:r>
+        <w:rPr>
+          <w:bCs/>
+          <w:sz w:val="16"/>
+          <w:szCs w:val="16"/>
+        </w:rPr>
+        <w:t>chr5:179616908-179617100</w:t>
       </w:r>
       <w:r>
         <w:rPr>
@@ -30919,8 +31329,9 @@
           <w:sz w:val="16"/>
           <w:szCs w:val="16"/>
         </w:rPr>
-        <w:t>LTR-containing introns are much more common in some clusters</w:t>
-      </w:r>
+        <w:t xml:space="preserve">LTR-containing introns are much more common in some </w:t>
+      </w:r>
+      <w:proofErr w:type="gramStart"/>
       <w:r>
         <w:rPr>
           <w:b/>
@@ -30928,7 +31339,26 @@
           <w:sz w:val="16"/>
           <w:szCs w:val="16"/>
         </w:rPr>
-        <w:t xml:space="preserve">, </w:t>
+        <w:t>clusters</w:t>
+      </w:r>
+      <w:r>
+        <w:rPr>
+          <w:b/>
+          <w:bCs/>
+          <w:sz w:val="16"/>
+          <w:szCs w:val="16"/>
+        </w:rPr>
+        <w:t>,</w:t>
+      </w:r>
+      <w:proofErr w:type="gramEnd"/>
+      <w:r>
+        <w:rPr>
+          <w:b/>
+          <w:bCs/>
+          <w:sz w:val="16"/>
+          <w:szCs w:val="16"/>
+        </w:rPr>
+        <w:t xml:space="preserve"> </w:t>
       </w:r>
       <w:r>
         <w:rPr>
@@ -35556,6 +35986,7 @@
         </w:rPr>
         <w:t>th</w:t>
       </w:r>
+      <w:proofErr w:type="gramStart"/>
       <w:r>
         <w:rPr>
           <w:b/>
@@ -35565,6 +35996,7 @@
         </w:rPr>
         <w:t xml:space="preserve"> 2025</w:t>
       </w:r>
+      <w:proofErr w:type="gramEnd"/>
     </w:p>
     <w:p>
       <w:pPr>
@@ -36081,15 +36513,7 @@
           <w:sz w:val="16"/>
           <w:szCs w:val="16"/>
         </w:rPr>
-        <w:t>CrypticsNoPRPF8Overlap</w:t>
-      </w:r>
-      <w:r>
-        <w:rPr>
-          <w:bCs/>
-          <w:sz w:val="16"/>
-          <w:szCs w:val="16"/>
-        </w:rPr>
-        <w:t>RepeatTest</w:t>
+        <w:t>CrypticsNoPRPF8OverlapRepeatTest</w:t>
       </w:r>
       <w:r>
         <w:rPr>
@@ -36109,6 +36533,1720 @@
           <w:szCs w:val="16"/>
         </w:rPr>
       </w:pPr>
+    </w:p>
+    <w:p>
+      <w:pPr>
+        <w:spacing w:after="0" w:line="240" w:lineRule="auto"/>
+        <w:rPr>
+          <w:b/>
+          <w:sz w:val="16"/>
+          <w:szCs w:val="16"/>
+          <w:u w:val="single"/>
+        </w:rPr>
+      </w:pPr>
+      <w:r>
+        <w:rPr>
+          <w:b/>
+          <w:sz w:val="16"/>
+          <w:szCs w:val="16"/>
+          <w:u w:val="single"/>
+        </w:rPr>
+        <w:t xml:space="preserve">August </w:t>
+      </w:r>
+      <w:r>
+        <w:rPr>
+          <w:b/>
+          <w:sz w:val="16"/>
+          <w:szCs w:val="16"/>
+          <w:u w:val="single"/>
+        </w:rPr>
+        <w:t>12</w:t>
+      </w:r>
+      <w:r>
+        <w:rPr>
+          <w:b/>
+          <w:sz w:val="16"/>
+          <w:szCs w:val="16"/>
+          <w:u w:val="single"/>
+          <w:vertAlign w:val="superscript"/>
+        </w:rPr>
+        <w:t>th</w:t>
+      </w:r>
+      <w:r>
+        <w:rPr>
+          <w:b/>
+          <w:sz w:val="16"/>
+          <w:szCs w:val="16"/>
+          <w:u w:val="single"/>
+          <w:vertAlign w:val="superscript"/>
+        </w:rPr>
+        <w:t>,</w:t>
+      </w:r>
+      <w:r>
+        <w:rPr>
+          <w:b/>
+          <w:sz w:val="16"/>
+          <w:szCs w:val="16"/>
+          <w:u w:val="single"/>
+        </w:rPr>
+        <w:t xml:space="preserve"> 2025</w:t>
+      </w:r>
+    </w:p>
+    <w:p>
+      <w:pPr>
+        <w:spacing w:after="0" w:line="240" w:lineRule="auto"/>
+        <w:rPr>
+          <w:bCs/>
+          <w:sz w:val="16"/>
+          <w:szCs w:val="16"/>
+        </w:rPr>
+      </w:pPr>
+    </w:p>
+    <w:p>
+      <w:pPr>
+        <w:spacing w:after="0" w:line="240" w:lineRule="auto"/>
+        <w:rPr>
+          <w:bCs/>
+          <w:sz w:val="16"/>
+          <w:szCs w:val="16"/>
+        </w:rPr>
+      </w:pPr>
+      <w:r>
+        <w:rPr>
+          <w:bCs/>
+          <w:sz w:val="16"/>
+          <w:szCs w:val="16"/>
+        </w:rPr>
+        <w:t xml:space="preserve">Create decoy splice site dataset that contains PRPF8 predictions, overlapping splice site predictions, and </w:t>
+      </w:r>
+      <w:proofErr w:type="spellStart"/>
+      <w:r>
+        <w:rPr>
+          <w:bCs/>
+          <w:sz w:val="16"/>
+          <w:szCs w:val="16"/>
+        </w:rPr>
+        <w:t>iCLIP</w:t>
+      </w:r>
+      <w:proofErr w:type="spellEnd"/>
+      <w:r>
+        <w:rPr>
+          <w:bCs/>
+          <w:sz w:val="16"/>
+          <w:szCs w:val="16"/>
+        </w:rPr>
+        <w:t xml:space="preserve"> data, with canonical splice sites removed.</w:t>
+      </w:r>
+    </w:p>
+    <w:p>
+      <w:pPr>
+        <w:spacing w:after="0" w:line="240" w:lineRule="auto"/>
+        <w:rPr>
+          <w:bCs/>
+          <w:sz w:val="16"/>
+          <w:szCs w:val="16"/>
+        </w:rPr>
+      </w:pPr>
+    </w:p>
+    <w:p>
+      <w:pPr>
+        <w:spacing w:after="0" w:line="240" w:lineRule="auto"/>
+        <w:rPr>
+          <w:bCs/>
+          <w:sz w:val="16"/>
+          <w:szCs w:val="16"/>
+        </w:rPr>
+      </w:pPr>
+      <w:r>
+        <w:rPr>
+          <w:bCs/>
+          <w:sz w:val="16"/>
+          <w:szCs w:val="16"/>
+        </w:rPr>
+        <w:t>bedtools intersect \</w:t>
+      </w:r>
+    </w:p>
+    <w:p>
+      <w:pPr>
+        <w:spacing w:after="0" w:line="240" w:lineRule="auto"/>
+        <w:rPr>
+          <w:bCs/>
+          <w:sz w:val="16"/>
+          <w:szCs w:val="16"/>
+        </w:rPr>
+      </w:pPr>
+      <w:r>
+        <w:rPr>
+          <w:bCs/>
+          <w:sz w:val="16"/>
+          <w:szCs w:val="16"/>
+        </w:rPr>
+        <w:t xml:space="preserve"> -a </w:t>
+      </w:r>
+      <w:r>
+        <w:rPr>
+          <w:bCs/>
+          <w:sz w:val="16"/>
+          <w:szCs w:val="16"/>
+        </w:rPr>
+        <w:t>../rbpnet/peaks/f</w:t>
+      </w:r>
+      <w:r>
+        <w:rPr>
+          <w:bCs/>
+          <w:sz w:val="16"/>
+          <w:szCs w:val="16"/>
+        </w:rPr>
+        <w:t>10</w:t>
+      </w:r>
+      <w:r>
+        <w:rPr>
+          <w:bCs/>
+          <w:sz w:val="16"/>
+          <w:szCs w:val="16"/>
+        </w:rPr>
+        <w:t>0/rbpnet_clippy_f</w:t>
+      </w:r>
+      <w:r>
+        <w:rPr>
+          <w:bCs/>
+          <w:sz w:val="16"/>
+          <w:szCs w:val="16"/>
+        </w:rPr>
+        <w:t>10</w:t>
+      </w:r>
+      <w:r>
+        <w:rPr>
+          <w:bCs/>
+          <w:sz w:val="16"/>
+          <w:szCs w:val="16"/>
+        </w:rPr>
+        <w:t>0_rollmean10_minHeightAdjust1.0_minPromAdjust1.0_minGeneCount5_Peaks.bed \</w:t>
+      </w:r>
+    </w:p>
+    <w:p>
+      <w:pPr>
+        <w:spacing w:after="0" w:line="240" w:lineRule="auto"/>
+        <w:rPr>
+          <w:bCs/>
+          <w:sz w:val="16"/>
+          <w:szCs w:val="16"/>
+        </w:rPr>
+      </w:pPr>
+      <w:r>
+        <w:rPr>
+          <w:bCs/>
+          <w:sz w:val="16"/>
+          <w:szCs w:val="16"/>
+        </w:rPr>
+        <w:t xml:space="preserve">  -b</w:t>
+      </w:r>
+      <w:r>
+        <w:rPr>
+          <w:bCs/>
+          <w:sz w:val="16"/>
+          <w:szCs w:val="16"/>
+        </w:rPr>
+        <w:t xml:space="preserve"> </w:t>
+      </w:r>
+      <w:r>
+        <w:rPr>
+          <w:bCs/>
+          <w:sz w:val="16"/>
+          <w:szCs w:val="16"/>
+        </w:rPr>
+        <w:t>../prpf8/PRPF8_iCLIP_HepG2_xlinks.bed \</w:t>
+      </w:r>
+    </w:p>
+    <w:p>
+      <w:pPr>
+        <w:spacing w:after="0" w:line="240" w:lineRule="auto"/>
+        <w:rPr>
+          <w:bCs/>
+          <w:sz w:val="16"/>
+          <w:szCs w:val="16"/>
+        </w:rPr>
+      </w:pPr>
+      <w:proofErr w:type="spellStart"/>
+      <w:r>
+        <w:rPr>
+          <w:bCs/>
+          <w:sz w:val="16"/>
+          <w:szCs w:val="16"/>
+        </w:rPr>
+        <w:t>Intersect_</w:t>
+      </w:r>
+      <w:r>
+        <w:rPr>
+          <w:bCs/>
+          <w:sz w:val="16"/>
+          <w:szCs w:val="16"/>
+        </w:rPr>
+        <w:t>SpliceSites</w:t>
+      </w:r>
+      <w:r>
+        <w:rPr>
+          <w:bCs/>
+          <w:sz w:val="16"/>
+          <w:szCs w:val="16"/>
+        </w:rPr>
+        <w:t>_</w:t>
+      </w:r>
+      <w:r>
+        <w:rPr>
+          <w:bCs/>
+          <w:sz w:val="16"/>
+          <w:szCs w:val="16"/>
+        </w:rPr>
+        <w:t>CrypticOnly.</w:t>
+      </w:r>
+      <w:r>
+        <w:rPr>
+          <w:bCs/>
+          <w:sz w:val="16"/>
+          <w:szCs w:val="16"/>
+        </w:rPr>
+        <w:t>bed</w:t>
+      </w:r>
+      <w:proofErr w:type="spellEnd"/>
+      <w:r>
+        <w:rPr>
+          <w:bCs/>
+          <w:sz w:val="16"/>
+          <w:szCs w:val="16"/>
+        </w:rPr>
+        <w:t xml:space="preserve"> \</w:t>
+      </w:r>
+    </w:p>
+    <w:p>
+      <w:pPr>
+        <w:spacing w:after="0" w:line="240" w:lineRule="auto"/>
+        <w:rPr>
+          <w:bCs/>
+          <w:sz w:val="16"/>
+          <w:szCs w:val="16"/>
+        </w:rPr>
+      </w:pPr>
+      <w:r>
+        <w:rPr>
+          <w:bCs/>
+          <w:sz w:val="16"/>
+          <w:szCs w:val="16"/>
+        </w:rPr>
+        <w:t xml:space="preserve">  -</w:t>
+      </w:r>
+      <w:r>
+        <w:rPr>
+          <w:bCs/>
+          <w:sz w:val="16"/>
+          <w:szCs w:val="16"/>
+        </w:rPr>
+        <w:t xml:space="preserve">c </w:t>
+      </w:r>
+      <w:r>
+        <w:rPr>
+          <w:bCs/>
+          <w:sz w:val="16"/>
+          <w:szCs w:val="16"/>
+        </w:rPr>
+        <w:t>\</w:t>
+      </w:r>
+    </w:p>
+    <w:p>
+      <w:pPr>
+        <w:spacing w:after="0" w:line="240" w:lineRule="auto"/>
+        <w:rPr>
+          <w:bCs/>
+          <w:sz w:val="16"/>
+          <w:szCs w:val="16"/>
+        </w:rPr>
+      </w:pPr>
+      <w:r>
+        <w:rPr>
+          <w:bCs/>
+          <w:sz w:val="16"/>
+          <w:szCs w:val="16"/>
+        </w:rPr>
+        <w:t xml:space="preserve">  -s \</w:t>
+      </w:r>
+    </w:p>
+    <w:p>
+      <w:pPr>
+        <w:spacing w:after="0" w:line="240" w:lineRule="auto"/>
+        <w:rPr>
+          <w:bCs/>
+          <w:sz w:val="16"/>
+          <w:szCs w:val="16"/>
+        </w:rPr>
+      </w:pPr>
+      <w:r>
+        <w:rPr>
+          <w:bCs/>
+          <w:sz w:val="16"/>
+          <w:szCs w:val="16"/>
+        </w:rPr>
+        <w:t xml:space="preserve">  &gt; Intersect_f</w:t>
+      </w:r>
+      <w:r>
+        <w:rPr>
+          <w:bCs/>
+          <w:sz w:val="16"/>
+          <w:szCs w:val="16"/>
+        </w:rPr>
+        <w:t>250</w:t>
+      </w:r>
+      <w:r>
+        <w:rPr>
+          <w:bCs/>
+          <w:sz w:val="16"/>
+          <w:szCs w:val="16"/>
+        </w:rPr>
+        <w:t>_</w:t>
+      </w:r>
+      <w:r>
+        <w:rPr>
+          <w:bCs/>
+          <w:sz w:val="16"/>
+          <w:szCs w:val="16"/>
+        </w:rPr>
+        <w:t>iCLIPCrypticsOverlap</w:t>
+      </w:r>
+      <w:r>
+        <w:rPr>
+          <w:bCs/>
+          <w:sz w:val="16"/>
+          <w:szCs w:val="16"/>
+        </w:rPr>
+        <w:t>.bed</w:t>
+      </w:r>
+    </w:p>
+    <w:p>
+      <w:pPr>
+        <w:spacing w:after="0" w:line="240" w:lineRule="auto"/>
+        <w:rPr>
+          <w:bCs/>
+          <w:sz w:val="16"/>
+          <w:szCs w:val="16"/>
+        </w:rPr>
+      </w:pPr>
+    </w:p>
+    <w:p>
+      <w:pPr>
+        <w:spacing w:after="0" w:line="240" w:lineRule="auto"/>
+        <w:rPr>
+          <w:b/>
+          <w:sz w:val="16"/>
+          <w:szCs w:val="16"/>
+          <w:u w:val="single"/>
+        </w:rPr>
+      </w:pPr>
+      <w:r>
+        <w:rPr>
+          <w:b/>
+          <w:sz w:val="16"/>
+          <w:szCs w:val="16"/>
+          <w:u w:val="single"/>
+        </w:rPr>
+        <w:t>August 13</w:t>
+      </w:r>
+      <w:r>
+        <w:rPr>
+          <w:b/>
+          <w:sz w:val="16"/>
+          <w:szCs w:val="16"/>
+          <w:u w:val="single"/>
+          <w:vertAlign w:val="superscript"/>
+        </w:rPr>
+        <w:t>th</w:t>
+      </w:r>
+      <w:proofErr w:type="gramStart"/>
+      <w:r>
+        <w:rPr>
+          <w:b/>
+          <w:sz w:val="16"/>
+          <w:szCs w:val="16"/>
+          <w:u w:val="single"/>
+        </w:rPr>
+        <w:t xml:space="preserve"> 2025</w:t>
+      </w:r>
+      <w:proofErr w:type="gramEnd"/>
+    </w:p>
+    <w:p>
+      <w:pPr>
+        <w:spacing w:after="0" w:line="240" w:lineRule="auto"/>
+        <w:rPr>
+          <w:bCs/>
+          <w:sz w:val="16"/>
+          <w:szCs w:val="16"/>
+        </w:rPr>
+      </w:pPr>
+    </w:p>
+    <w:p>
+      <w:pPr>
+        <w:spacing w:after="0" w:line="240" w:lineRule="auto"/>
+        <w:rPr>
+          <w:bCs/>
+          <w:sz w:val="16"/>
+          <w:szCs w:val="16"/>
+        </w:rPr>
+      </w:pPr>
+      <w:r>
+        <w:rPr>
+          <w:bCs/>
+          <w:sz w:val="16"/>
+          <w:szCs w:val="16"/>
+        </w:rPr>
+        <w:t xml:space="preserve">Create new decoy sites data set for sites that are seen in any of </w:t>
+      </w:r>
+      <w:proofErr w:type="spellStart"/>
+      <w:r>
+        <w:rPr>
+          <w:bCs/>
+          <w:sz w:val="16"/>
+          <w:szCs w:val="16"/>
+        </w:rPr>
+        <w:t>eCLIP</w:t>
+      </w:r>
+      <w:proofErr w:type="spellEnd"/>
+      <w:r>
+        <w:rPr>
+          <w:bCs/>
+          <w:sz w:val="16"/>
+          <w:szCs w:val="16"/>
+        </w:rPr>
+        <w:t xml:space="preserve">, </w:t>
+      </w:r>
+      <w:proofErr w:type="spellStart"/>
+      <w:r>
+        <w:rPr>
+          <w:bCs/>
+          <w:sz w:val="16"/>
+          <w:szCs w:val="16"/>
+        </w:rPr>
+        <w:t>iCLIP</w:t>
+      </w:r>
+      <w:proofErr w:type="spellEnd"/>
+      <w:r>
+        <w:rPr>
+          <w:bCs/>
+          <w:sz w:val="16"/>
+          <w:szCs w:val="16"/>
+        </w:rPr>
+        <w:t>, or PRPF8 predictions</w:t>
+      </w:r>
+      <w:r>
+        <w:rPr>
+          <w:bCs/>
+          <w:sz w:val="16"/>
+          <w:szCs w:val="16"/>
+        </w:rPr>
+        <w:t>, in step two remove any canonical splice sites with a 100 bp window</w:t>
+      </w:r>
+    </w:p>
+    <w:p>
+      <w:pPr>
+        <w:spacing w:after="0" w:line="240" w:lineRule="auto"/>
+        <w:rPr>
+          <w:bCs/>
+          <w:sz w:val="16"/>
+          <w:szCs w:val="16"/>
+        </w:rPr>
+      </w:pPr>
+    </w:p>
+    <w:p>
+      <w:pPr>
+        <w:spacing w:after="0" w:line="240" w:lineRule="auto"/>
+        <w:rPr>
+          <w:bCs/>
+          <w:sz w:val="16"/>
+          <w:szCs w:val="16"/>
+        </w:rPr>
+      </w:pPr>
+      <w:r>
+        <w:rPr>
+          <w:bCs/>
+          <w:sz w:val="16"/>
+          <w:szCs w:val="16"/>
+        </w:rPr>
+        <w:t>bedtools intersect \</w:t>
+      </w:r>
+    </w:p>
+    <w:p>
+      <w:pPr>
+        <w:spacing w:after="0" w:line="240" w:lineRule="auto"/>
+        <w:rPr>
+          <w:bCs/>
+          <w:sz w:val="16"/>
+          <w:szCs w:val="16"/>
+        </w:rPr>
+      </w:pPr>
+      <w:r>
+        <w:rPr>
+          <w:bCs/>
+          <w:sz w:val="16"/>
+          <w:szCs w:val="16"/>
+        </w:rPr>
+        <w:t xml:space="preserve">  -a ../splice/Splice_All.filtered.2e-4.bed \</w:t>
+      </w:r>
+    </w:p>
+    <w:p>
+      <w:pPr>
+        <w:spacing w:after="0" w:line="240" w:lineRule="auto"/>
+        <w:rPr>
+          <w:bCs/>
+          <w:sz w:val="16"/>
+          <w:szCs w:val="16"/>
+        </w:rPr>
+      </w:pPr>
+      <w:r>
+        <w:rPr>
+          <w:bCs/>
+          <w:sz w:val="16"/>
+          <w:szCs w:val="16"/>
+        </w:rPr>
+        <w:t xml:space="preserve">  -b ../rbpnet/peaks/f</w:t>
+      </w:r>
+      <w:r>
+        <w:rPr>
+          <w:bCs/>
+          <w:sz w:val="16"/>
+          <w:szCs w:val="16"/>
+        </w:rPr>
+        <w:t>5</w:t>
+      </w:r>
+      <w:r>
+        <w:rPr>
+          <w:bCs/>
+          <w:sz w:val="16"/>
+          <w:szCs w:val="16"/>
+        </w:rPr>
+        <w:t>0/rbpnet_clippy_f</w:t>
+      </w:r>
+      <w:r>
+        <w:rPr>
+          <w:bCs/>
+          <w:sz w:val="16"/>
+          <w:szCs w:val="16"/>
+        </w:rPr>
+        <w:t>5</w:t>
+      </w:r>
+      <w:r>
+        <w:rPr>
+          <w:bCs/>
+          <w:sz w:val="16"/>
+          <w:szCs w:val="16"/>
+        </w:rPr>
+        <w:t>0_rollmean10_minHeightAdjust1.0_minPromAdjust1.0_minGeneCount5_Peaks.bed \</w:t>
+      </w:r>
+    </w:p>
+    <w:p>
+      <w:pPr>
+        <w:spacing w:after="0" w:line="240" w:lineRule="auto"/>
+        <w:rPr>
+          <w:bCs/>
+          <w:sz w:val="16"/>
+          <w:szCs w:val="16"/>
+        </w:rPr>
+      </w:pPr>
+      <w:r>
+        <w:rPr>
+          <w:bCs/>
+          <w:sz w:val="16"/>
+          <w:szCs w:val="16"/>
+        </w:rPr>
+        <w:t xml:space="preserve">     ../prpf8/PRPF8_iCLIP_HepG2_xlinks.bed \</w:t>
+      </w:r>
+    </w:p>
+    <w:p>
+      <w:pPr>
+        <w:spacing w:after="0" w:line="240" w:lineRule="auto"/>
+        <w:rPr>
+          <w:bCs/>
+          <w:sz w:val="16"/>
+          <w:szCs w:val="16"/>
+        </w:rPr>
+      </w:pPr>
+      <w:r>
+        <w:rPr>
+          <w:bCs/>
+          <w:sz w:val="16"/>
+          <w:szCs w:val="16"/>
+        </w:rPr>
+        <w:t xml:space="preserve">     ../eCLIP/PRPF8_eCLIP_HepG2_rollmean10_minHeightAdjust1.0_minPromAdjust1.0_minGeneCount5_Peaks.bed \</w:t>
+      </w:r>
+    </w:p>
+    <w:p>
+      <w:pPr>
+        <w:spacing w:after="0" w:line="240" w:lineRule="auto"/>
+        <w:rPr>
+          <w:bCs/>
+          <w:sz w:val="16"/>
+          <w:szCs w:val="16"/>
+        </w:rPr>
+      </w:pPr>
+      <w:r>
+        <w:rPr>
+          <w:bCs/>
+          <w:sz w:val="16"/>
+          <w:szCs w:val="16"/>
+        </w:rPr>
+        <w:t xml:space="preserve">  -c \</w:t>
+      </w:r>
+    </w:p>
+    <w:p>
+      <w:pPr>
+        <w:spacing w:after="0" w:line="240" w:lineRule="auto"/>
+        <w:rPr>
+          <w:bCs/>
+          <w:sz w:val="16"/>
+          <w:szCs w:val="16"/>
+        </w:rPr>
+      </w:pPr>
+      <w:r>
+        <w:rPr>
+          <w:bCs/>
+          <w:sz w:val="16"/>
+          <w:szCs w:val="16"/>
+        </w:rPr>
+        <w:t xml:space="preserve">  -s \</w:t>
+      </w:r>
+    </w:p>
+    <w:p>
+      <w:pPr>
+        <w:spacing w:after="0" w:line="240" w:lineRule="auto"/>
+        <w:rPr>
+          <w:bCs/>
+          <w:sz w:val="16"/>
+          <w:szCs w:val="16"/>
+        </w:rPr>
+      </w:pPr>
+      <w:r>
+        <w:rPr>
+          <w:bCs/>
+          <w:sz w:val="16"/>
+          <w:szCs w:val="16"/>
+        </w:rPr>
+        <w:t>| awk '$NF &gt; 0' &gt; SupportedSpliceSites_f</w:t>
+      </w:r>
+      <w:r>
+        <w:rPr>
+          <w:bCs/>
+          <w:sz w:val="16"/>
+          <w:szCs w:val="16"/>
+        </w:rPr>
+        <w:t>50</w:t>
+      </w:r>
+      <w:r>
+        <w:rPr>
+          <w:bCs/>
+          <w:sz w:val="16"/>
+          <w:szCs w:val="16"/>
+        </w:rPr>
+        <w:t>.bed</w:t>
+      </w:r>
+    </w:p>
+    <w:p>
+      <w:pPr>
+        <w:spacing w:after="0" w:line="240" w:lineRule="auto"/>
+        <w:rPr>
+          <w:bCs/>
+          <w:sz w:val="16"/>
+          <w:szCs w:val="16"/>
+        </w:rPr>
+      </w:pPr>
+    </w:p>
+    <w:p>
+      <w:pPr>
+        <w:spacing w:after="0" w:line="240" w:lineRule="auto"/>
+        <w:rPr>
+          <w:bCs/>
+          <w:sz w:val="16"/>
+          <w:szCs w:val="16"/>
+        </w:rPr>
+      </w:pPr>
+      <w:r>
+        <w:rPr>
+          <w:bCs/>
+          <w:sz w:val="16"/>
+          <w:szCs w:val="16"/>
+        </w:rPr>
+        <w:t>bedtools intersect \</w:t>
+      </w:r>
+    </w:p>
+    <w:p>
+      <w:pPr>
+        <w:spacing w:after="0" w:line="240" w:lineRule="auto"/>
+        <w:rPr>
+          <w:bCs/>
+          <w:sz w:val="16"/>
+          <w:szCs w:val="16"/>
+        </w:rPr>
+      </w:pPr>
+      <w:r>
+        <w:rPr>
+          <w:bCs/>
+          <w:sz w:val="16"/>
+          <w:szCs w:val="16"/>
+        </w:rPr>
+        <w:t xml:space="preserve">-a </w:t>
+      </w:r>
+      <w:r>
+        <w:rPr>
+          <w:bCs/>
+          <w:sz w:val="16"/>
+          <w:szCs w:val="16"/>
+        </w:rPr>
+        <w:t>SupportedSpliceSites_f</w:t>
+      </w:r>
+      <w:r>
+        <w:rPr>
+          <w:bCs/>
+          <w:sz w:val="16"/>
+          <w:szCs w:val="16"/>
+        </w:rPr>
+        <w:t>100</w:t>
+      </w:r>
+      <w:r>
+        <w:rPr>
+          <w:bCs/>
+          <w:sz w:val="16"/>
+          <w:szCs w:val="16"/>
+        </w:rPr>
+        <w:t>.bed</w:t>
+      </w:r>
+      <w:r>
+        <w:rPr>
+          <w:bCs/>
+          <w:sz w:val="16"/>
+          <w:szCs w:val="16"/>
+        </w:rPr>
+        <w:t xml:space="preserve"> \</w:t>
+      </w:r>
+    </w:p>
+    <w:p>
+      <w:pPr>
+        <w:spacing w:after="0" w:line="240" w:lineRule="auto"/>
+        <w:rPr>
+          <w:bCs/>
+          <w:sz w:val="16"/>
+          <w:szCs w:val="16"/>
+        </w:rPr>
+      </w:pPr>
+      <w:r>
+        <w:rPr>
+          <w:bCs/>
+          <w:sz w:val="16"/>
+          <w:szCs w:val="16"/>
+        </w:rPr>
+        <w:t>-b ../</w:t>
+      </w:r>
+      <w:proofErr w:type="spellStart"/>
+      <w:r>
+        <w:rPr>
+          <w:bCs/>
+          <w:sz w:val="16"/>
+          <w:szCs w:val="16"/>
+        </w:rPr>
+        <w:t>rbpnet</w:t>
+      </w:r>
+      <w:proofErr w:type="spellEnd"/>
+      <w:r>
+        <w:rPr>
+          <w:bCs/>
+          <w:sz w:val="16"/>
+          <w:szCs w:val="16"/>
+        </w:rPr>
+        <w:t>/</w:t>
+      </w:r>
+      <w:proofErr w:type="spellStart"/>
+      <w:r>
+        <w:rPr>
+          <w:bCs/>
+          <w:sz w:val="16"/>
+          <w:szCs w:val="16"/>
+        </w:rPr>
+        <w:t>Wide_Canonical_splice_sites.bed</w:t>
+      </w:r>
+      <w:proofErr w:type="spellEnd"/>
+      <w:r>
+        <w:rPr>
+          <w:bCs/>
+          <w:sz w:val="16"/>
+          <w:szCs w:val="16"/>
+        </w:rPr>
+        <w:t xml:space="preserve"> \</w:t>
+      </w:r>
+    </w:p>
+    <w:p>
+      <w:pPr>
+        <w:spacing w:after="0" w:line="240" w:lineRule="auto"/>
+        <w:rPr>
+          <w:bCs/>
+          <w:sz w:val="16"/>
+          <w:szCs w:val="16"/>
+        </w:rPr>
+      </w:pPr>
+      <w:r>
+        <w:rPr>
+          <w:bCs/>
+          <w:sz w:val="16"/>
+          <w:szCs w:val="16"/>
+        </w:rPr>
+        <w:t>-v \</w:t>
+      </w:r>
+    </w:p>
+    <w:p>
+      <w:pPr>
+        <w:spacing w:after="0" w:line="240" w:lineRule="auto"/>
+        <w:rPr>
+          <w:bCs/>
+          <w:sz w:val="16"/>
+          <w:szCs w:val="16"/>
+        </w:rPr>
+      </w:pPr>
+      <w:r>
+        <w:rPr>
+          <w:bCs/>
+          <w:sz w:val="16"/>
+          <w:szCs w:val="16"/>
+        </w:rPr>
+        <w:t>-s \</w:t>
+      </w:r>
+    </w:p>
+    <w:p>
+      <w:pPr>
+        <w:spacing w:after="0" w:line="240" w:lineRule="auto"/>
+        <w:rPr>
+          <w:bCs/>
+          <w:sz w:val="16"/>
+          <w:szCs w:val="16"/>
+        </w:rPr>
+      </w:pPr>
+      <w:r>
+        <w:rPr>
+          <w:bCs/>
+          <w:sz w:val="16"/>
+          <w:szCs w:val="16"/>
+        </w:rPr>
+        <w:t>&gt; DecoySpliceSites_f100.bed</w:t>
+      </w:r>
+      <w:r>
+        <w:rPr>
+          <w:bCs/>
+          <w:sz w:val="16"/>
+          <w:szCs w:val="16"/>
+        </w:rPr>
+        <w:t xml:space="preserve"> </w:t>
+      </w:r>
+    </w:p>
+    <w:p>
+      <w:pPr>
+        <w:spacing w:after="0" w:line="240" w:lineRule="auto"/>
+        <w:rPr>
+          <w:bCs/>
+          <w:sz w:val="16"/>
+          <w:szCs w:val="16"/>
+        </w:rPr>
+      </w:pPr>
+    </w:p>
+    <w:p>
+      <w:pPr>
+        <w:spacing w:after="0" w:line="240" w:lineRule="auto"/>
+        <w:rPr>
+          <w:bCs/>
+          <w:sz w:val="16"/>
+          <w:szCs w:val="16"/>
+        </w:rPr>
+      </w:pPr>
+      <w:r>
+        <w:rPr>
+          <w:bCs/>
+          <w:sz w:val="16"/>
+          <w:szCs w:val="16"/>
+        </w:rPr>
+        <w:t xml:space="preserve">Regenerate splice sites with no PRPF8, </w:t>
+      </w:r>
+      <w:proofErr w:type="spellStart"/>
+      <w:r>
+        <w:rPr>
+          <w:bCs/>
+          <w:sz w:val="16"/>
+          <w:szCs w:val="16"/>
+        </w:rPr>
+        <w:t>iCLIP</w:t>
+      </w:r>
+      <w:proofErr w:type="spellEnd"/>
+      <w:r>
+        <w:rPr>
+          <w:bCs/>
+          <w:sz w:val="16"/>
+          <w:szCs w:val="16"/>
+        </w:rPr>
+        <w:t xml:space="preserve">, or </w:t>
+      </w:r>
+      <w:proofErr w:type="spellStart"/>
+      <w:r>
+        <w:rPr>
+          <w:bCs/>
+          <w:sz w:val="16"/>
+          <w:szCs w:val="16"/>
+        </w:rPr>
+        <w:t>eCLIP</w:t>
+      </w:r>
+      <w:proofErr w:type="spellEnd"/>
+      <w:r>
+        <w:rPr>
+          <w:bCs/>
+          <w:sz w:val="16"/>
+          <w:szCs w:val="16"/>
+        </w:rPr>
+        <w:t xml:space="preserve"> overlap</w:t>
+      </w:r>
+    </w:p>
+    <w:p>
+      <w:pPr>
+        <w:spacing w:after="0" w:line="240" w:lineRule="auto"/>
+        <w:rPr>
+          <w:bCs/>
+          <w:sz w:val="16"/>
+          <w:szCs w:val="16"/>
+        </w:rPr>
+      </w:pPr>
+    </w:p>
+    <w:p>
+      <w:pPr>
+        <w:spacing w:after="0" w:line="240" w:lineRule="auto"/>
+        <w:rPr>
+          <w:bCs/>
+          <w:sz w:val="16"/>
+          <w:szCs w:val="16"/>
+        </w:rPr>
+      </w:pPr>
+      <w:r>
+        <w:rPr>
+          <w:bCs/>
+          <w:sz w:val="16"/>
+          <w:szCs w:val="16"/>
+        </w:rPr>
+        <w:t>bedtools intersect \</w:t>
+      </w:r>
+    </w:p>
+    <w:p>
+      <w:pPr>
+        <w:spacing w:after="0" w:line="240" w:lineRule="auto"/>
+        <w:rPr>
+          <w:bCs/>
+          <w:sz w:val="16"/>
+          <w:szCs w:val="16"/>
+        </w:rPr>
+      </w:pPr>
+      <w:r>
+        <w:rPr>
+          <w:bCs/>
+          <w:sz w:val="16"/>
+          <w:szCs w:val="16"/>
+        </w:rPr>
+        <w:t xml:space="preserve">  -a ../splice/Splice_All.filtered.2e-4.bed \</w:t>
+      </w:r>
+    </w:p>
+    <w:p>
+      <w:pPr>
+        <w:spacing w:after="0" w:line="240" w:lineRule="auto"/>
+        <w:rPr>
+          <w:bCs/>
+          <w:sz w:val="16"/>
+          <w:szCs w:val="16"/>
+        </w:rPr>
+      </w:pPr>
+      <w:r>
+        <w:rPr>
+          <w:bCs/>
+          <w:sz w:val="16"/>
+          <w:szCs w:val="16"/>
+        </w:rPr>
+        <w:t xml:space="preserve">  -b ../rbpnet/peaks/f</w:t>
+      </w:r>
+      <w:r>
+        <w:rPr>
+          <w:bCs/>
+          <w:sz w:val="16"/>
+          <w:szCs w:val="16"/>
+        </w:rPr>
+        <w:t>25</w:t>
+      </w:r>
+      <w:r>
+        <w:rPr>
+          <w:bCs/>
+          <w:sz w:val="16"/>
+          <w:szCs w:val="16"/>
+        </w:rPr>
+        <w:t>0/rbpnet_clippy_f</w:t>
+      </w:r>
+      <w:r>
+        <w:rPr>
+          <w:bCs/>
+          <w:sz w:val="16"/>
+          <w:szCs w:val="16"/>
+        </w:rPr>
+        <w:t>25</w:t>
+      </w:r>
+      <w:r>
+        <w:rPr>
+          <w:bCs/>
+          <w:sz w:val="16"/>
+          <w:szCs w:val="16"/>
+        </w:rPr>
+        <w:t>0_rollmean10_minHeightAdjust1.0_minPromAdjust1.0_minGeneCount5_Peaks.bed \</w:t>
+      </w:r>
+    </w:p>
+    <w:p>
+      <w:pPr>
+        <w:spacing w:after="0" w:line="240" w:lineRule="auto"/>
+        <w:rPr>
+          <w:bCs/>
+          <w:sz w:val="16"/>
+          <w:szCs w:val="16"/>
+        </w:rPr>
+      </w:pPr>
+      <w:r>
+        <w:rPr>
+          <w:bCs/>
+          <w:sz w:val="16"/>
+          <w:szCs w:val="16"/>
+        </w:rPr>
+        <w:t xml:space="preserve">     ../prpf8/PRPF8_iCLIP_HepG2_xlinks.bed \</w:t>
+      </w:r>
+    </w:p>
+    <w:p>
+      <w:pPr>
+        <w:spacing w:after="0" w:line="240" w:lineRule="auto"/>
+        <w:rPr>
+          <w:bCs/>
+          <w:sz w:val="16"/>
+          <w:szCs w:val="16"/>
+        </w:rPr>
+      </w:pPr>
+      <w:r>
+        <w:rPr>
+          <w:bCs/>
+          <w:sz w:val="16"/>
+          <w:szCs w:val="16"/>
+        </w:rPr>
+        <w:t xml:space="preserve">     ../eCLIP/PRPF8_eCLIP_HepG2_rollmean10_minHeightAdjust1.0_minPromAdjust1.0_minGeneCount5_Peaks.bed \</w:t>
+      </w:r>
+    </w:p>
+    <w:p>
+      <w:pPr>
+        <w:spacing w:after="0" w:line="240" w:lineRule="auto"/>
+        <w:rPr>
+          <w:bCs/>
+          <w:sz w:val="16"/>
+          <w:szCs w:val="16"/>
+        </w:rPr>
+      </w:pPr>
+      <w:r>
+        <w:rPr>
+          <w:bCs/>
+          <w:sz w:val="16"/>
+          <w:szCs w:val="16"/>
+        </w:rPr>
+        <w:t xml:space="preserve">  -</w:t>
+      </w:r>
+      <w:r>
+        <w:rPr>
+          <w:bCs/>
+          <w:sz w:val="16"/>
+          <w:szCs w:val="16"/>
+        </w:rPr>
+        <w:t>v</w:t>
+      </w:r>
+      <w:r>
+        <w:rPr>
+          <w:bCs/>
+          <w:sz w:val="16"/>
+          <w:szCs w:val="16"/>
+        </w:rPr>
+        <w:t xml:space="preserve"> \</w:t>
+      </w:r>
+    </w:p>
+    <w:p>
+      <w:pPr>
+        <w:spacing w:after="0" w:line="240" w:lineRule="auto"/>
+        <w:rPr>
+          <w:bCs/>
+          <w:sz w:val="16"/>
+          <w:szCs w:val="16"/>
+        </w:rPr>
+      </w:pPr>
+      <w:r>
+        <w:rPr>
+          <w:bCs/>
+          <w:sz w:val="16"/>
+          <w:szCs w:val="16"/>
+        </w:rPr>
+        <w:t xml:space="preserve">  -s \</w:t>
+      </w:r>
+    </w:p>
+    <w:p>
+      <w:pPr>
+        <w:spacing w:after="0" w:line="240" w:lineRule="auto"/>
+        <w:rPr>
+          <w:bCs/>
+          <w:sz w:val="16"/>
+          <w:szCs w:val="16"/>
+        </w:rPr>
+      </w:pPr>
+      <w:r>
+        <w:rPr>
+          <w:bCs/>
+          <w:sz w:val="16"/>
+          <w:szCs w:val="16"/>
+        </w:rPr>
+        <w:t xml:space="preserve">&gt; </w:t>
+      </w:r>
+      <w:r>
+        <w:rPr>
+          <w:bCs/>
+          <w:sz w:val="16"/>
+          <w:szCs w:val="16"/>
+        </w:rPr>
+        <w:t>Uns</w:t>
+      </w:r>
+      <w:r>
+        <w:rPr>
+          <w:bCs/>
+          <w:sz w:val="16"/>
+          <w:szCs w:val="16"/>
+        </w:rPr>
+        <w:t>upportedSpliceSites_f</w:t>
+      </w:r>
+      <w:r>
+        <w:rPr>
+          <w:bCs/>
+          <w:sz w:val="16"/>
+          <w:szCs w:val="16"/>
+        </w:rPr>
+        <w:t>25</w:t>
+      </w:r>
+      <w:r>
+        <w:rPr>
+          <w:bCs/>
+          <w:sz w:val="16"/>
+          <w:szCs w:val="16"/>
+        </w:rPr>
+        <w:t>0</w:t>
+      </w:r>
+      <w:r>
+        <w:rPr>
+          <w:bCs/>
+          <w:sz w:val="16"/>
+          <w:szCs w:val="16"/>
+        </w:rPr>
+        <w:t>.bed</w:t>
+      </w:r>
+    </w:p>
+    <w:p>
+      <w:pPr>
+        <w:spacing w:after="0" w:line="240" w:lineRule="auto"/>
+        <w:rPr>
+          <w:bCs/>
+          <w:sz w:val="16"/>
+          <w:szCs w:val="16"/>
+        </w:rPr>
+      </w:pPr>
+    </w:p>
+    <w:p>
+      <w:pPr>
+        <w:spacing w:after="0" w:line="240" w:lineRule="auto"/>
+        <w:rPr>
+          <w:bCs/>
+          <w:sz w:val="16"/>
+          <w:szCs w:val="16"/>
+        </w:rPr>
+      </w:pPr>
+      <w:r>
+        <w:rPr>
+          <w:bCs/>
+          <w:sz w:val="16"/>
+          <w:szCs w:val="16"/>
+        </w:rPr>
+        <w:t>bedtools intersect \</w:t>
+      </w:r>
+    </w:p>
+    <w:p>
+      <w:pPr>
+        <w:spacing w:after="0" w:line="240" w:lineRule="auto"/>
+        <w:rPr>
+          <w:bCs/>
+          <w:sz w:val="16"/>
+          <w:szCs w:val="16"/>
+        </w:rPr>
+      </w:pPr>
+      <w:r>
+        <w:rPr>
+          <w:bCs/>
+          <w:sz w:val="16"/>
+          <w:szCs w:val="16"/>
+        </w:rPr>
+        <w:t>-a Uns</w:t>
+      </w:r>
+      <w:r>
+        <w:rPr>
+          <w:bCs/>
+          <w:sz w:val="16"/>
+          <w:szCs w:val="16"/>
+        </w:rPr>
+        <w:t>upportedSpliceSites_f</w:t>
+      </w:r>
+      <w:r>
+        <w:rPr>
+          <w:bCs/>
+          <w:sz w:val="16"/>
+          <w:szCs w:val="16"/>
+        </w:rPr>
+        <w:t>25</w:t>
+      </w:r>
+      <w:r>
+        <w:rPr>
+          <w:bCs/>
+          <w:sz w:val="16"/>
+          <w:szCs w:val="16"/>
+        </w:rPr>
+        <w:t>0</w:t>
+      </w:r>
+      <w:r>
+        <w:rPr>
+          <w:bCs/>
+          <w:sz w:val="16"/>
+          <w:szCs w:val="16"/>
+        </w:rPr>
+        <w:t>.bed</w:t>
+      </w:r>
+      <w:r>
+        <w:rPr>
+          <w:bCs/>
+          <w:sz w:val="16"/>
+          <w:szCs w:val="16"/>
+        </w:rPr>
+        <w:t xml:space="preserve"> \</w:t>
+      </w:r>
+    </w:p>
+    <w:p>
+      <w:pPr>
+        <w:spacing w:after="0" w:line="240" w:lineRule="auto"/>
+        <w:rPr>
+          <w:bCs/>
+          <w:sz w:val="16"/>
+          <w:szCs w:val="16"/>
+        </w:rPr>
+      </w:pPr>
+      <w:r>
+        <w:rPr>
+          <w:bCs/>
+          <w:sz w:val="16"/>
+          <w:szCs w:val="16"/>
+        </w:rPr>
+        <w:t>-b ../</w:t>
+      </w:r>
+      <w:proofErr w:type="spellStart"/>
+      <w:r>
+        <w:rPr>
+          <w:bCs/>
+          <w:sz w:val="16"/>
+          <w:szCs w:val="16"/>
+        </w:rPr>
+        <w:t>rbpnet</w:t>
+      </w:r>
+      <w:proofErr w:type="spellEnd"/>
+      <w:r>
+        <w:rPr>
+          <w:bCs/>
+          <w:sz w:val="16"/>
+          <w:szCs w:val="16"/>
+        </w:rPr>
+        <w:t>/</w:t>
+      </w:r>
+      <w:proofErr w:type="spellStart"/>
+      <w:r>
+        <w:rPr>
+          <w:bCs/>
+          <w:sz w:val="16"/>
+          <w:szCs w:val="16"/>
+        </w:rPr>
+        <w:t>Wide_Canonical_splice_sites.bed</w:t>
+      </w:r>
+      <w:proofErr w:type="spellEnd"/>
+      <w:r>
+        <w:rPr>
+          <w:bCs/>
+          <w:sz w:val="16"/>
+          <w:szCs w:val="16"/>
+        </w:rPr>
+        <w:t xml:space="preserve"> \</w:t>
+      </w:r>
+    </w:p>
+    <w:p>
+      <w:pPr>
+        <w:spacing w:after="0" w:line="240" w:lineRule="auto"/>
+        <w:rPr>
+          <w:bCs/>
+          <w:sz w:val="16"/>
+          <w:szCs w:val="16"/>
+        </w:rPr>
+      </w:pPr>
+      <w:r>
+        <w:rPr>
+          <w:bCs/>
+          <w:sz w:val="16"/>
+          <w:szCs w:val="16"/>
+        </w:rPr>
+        <w:lastRenderedPageBreak/>
+        <w:t>-v \</w:t>
+      </w:r>
+    </w:p>
+    <w:p>
+      <w:pPr>
+        <w:spacing w:after="0" w:line="240" w:lineRule="auto"/>
+        <w:rPr>
+          <w:bCs/>
+          <w:sz w:val="16"/>
+          <w:szCs w:val="16"/>
+        </w:rPr>
+      </w:pPr>
+      <w:r>
+        <w:rPr>
+          <w:bCs/>
+          <w:sz w:val="16"/>
+          <w:szCs w:val="16"/>
+        </w:rPr>
+        <w:t>-s \</w:t>
+      </w:r>
+    </w:p>
+    <w:p>
+      <w:pPr>
+        <w:spacing w:after="0" w:line="240" w:lineRule="auto"/>
+        <w:rPr>
+          <w:bCs/>
+          <w:sz w:val="16"/>
+          <w:szCs w:val="16"/>
+        </w:rPr>
+      </w:pPr>
+      <w:r>
+        <w:rPr>
+          <w:bCs/>
+          <w:sz w:val="16"/>
+          <w:szCs w:val="16"/>
+        </w:rPr>
+        <w:t xml:space="preserve">&gt; </w:t>
+      </w:r>
+      <w:r>
+        <w:rPr>
+          <w:bCs/>
+          <w:sz w:val="16"/>
+          <w:szCs w:val="16"/>
+        </w:rPr>
+        <w:t>NonPRPF8</w:t>
+      </w:r>
+      <w:r>
+        <w:rPr>
+          <w:bCs/>
+          <w:sz w:val="16"/>
+          <w:szCs w:val="16"/>
+        </w:rPr>
+        <w:t>SpliceSites_f</w:t>
+      </w:r>
+      <w:r>
+        <w:rPr>
+          <w:bCs/>
+          <w:sz w:val="16"/>
+          <w:szCs w:val="16"/>
+        </w:rPr>
+        <w:t>25</w:t>
+      </w:r>
+      <w:r>
+        <w:rPr>
+          <w:bCs/>
+          <w:sz w:val="16"/>
+          <w:szCs w:val="16"/>
+        </w:rPr>
+        <w:t xml:space="preserve">0.bed </w:t>
+      </w:r>
+    </w:p>
+    <w:p>
+      <w:pPr>
+        <w:spacing w:after="0" w:line="240" w:lineRule="auto"/>
+        <w:rPr>
+          <w:bCs/>
+          <w:sz w:val="16"/>
+          <w:szCs w:val="16"/>
+        </w:rPr>
+      </w:pPr>
+    </w:p>
+    <w:p>
+      <w:pPr>
+        <w:spacing w:after="0" w:line="240" w:lineRule="auto"/>
+        <w:rPr>
+          <w:bCs/>
+          <w:sz w:val="16"/>
+          <w:szCs w:val="16"/>
+        </w:rPr>
+      </w:pPr>
+      <w:r>
+        <w:rPr>
+          <w:bCs/>
+          <w:sz w:val="16"/>
+          <w:szCs w:val="16"/>
+        </w:rPr>
+        <w:t xml:space="preserve">ANNOTATION OVERLAP – </w:t>
+      </w:r>
+    </w:p>
+    <w:p>
+      <w:pPr>
+        <w:pStyle w:val="ListParagraph"/>
+        <w:numPr>
+          <w:ilvl w:val="0"/>
+          <w:numId w:val="47"/>
+        </w:numPr>
+        <w:spacing w:after="0" w:line="240" w:lineRule="auto"/>
+        <w:rPr>
+          <w:bCs/>
+          <w:sz w:val="16"/>
+          <w:szCs w:val="16"/>
+        </w:rPr>
+      </w:pPr>
+      <w:r>
+        <w:rPr>
+          <w:bCs/>
+          <w:sz w:val="16"/>
+          <w:szCs w:val="16"/>
+        </w:rPr>
+        <w:t>PRPF8 prediction sums ~</w:t>
+      </w:r>
+      <w:proofErr w:type="spellStart"/>
+      <w:r>
+        <w:rPr>
+          <w:bCs/>
+          <w:sz w:val="16"/>
+          <w:szCs w:val="16"/>
+        </w:rPr>
+        <w:t>advbfx</w:t>
+      </w:r>
+      <w:proofErr w:type="spellEnd"/>
+      <w:r>
+        <w:rPr>
+          <w:bCs/>
+          <w:sz w:val="16"/>
+          <w:szCs w:val="16"/>
+        </w:rPr>
+        <w:t>/data/IR/</w:t>
+      </w:r>
+      <w:proofErr w:type="spellStart"/>
+      <w:r>
+        <w:rPr>
+          <w:bCs/>
+          <w:sz w:val="16"/>
+          <w:szCs w:val="16"/>
+        </w:rPr>
+        <w:t>pred_sums.tsv</w:t>
+      </w:r>
+      <w:proofErr w:type="spellEnd"/>
+    </w:p>
+    <w:p>
+      <w:pPr>
+        <w:pStyle w:val="ListParagraph"/>
+        <w:numPr>
+          <w:ilvl w:val="1"/>
+          <w:numId w:val="47"/>
+        </w:numPr>
+        <w:spacing w:after="0" w:line="240" w:lineRule="auto"/>
+        <w:rPr>
+          <w:bCs/>
+          <w:sz w:val="16"/>
+          <w:szCs w:val="16"/>
+        </w:rPr>
+      </w:pPr>
+      <w:r>
+        <w:rPr>
+          <w:bCs/>
+          <w:sz w:val="16"/>
+          <w:szCs w:val="16"/>
+        </w:rPr>
+        <w:t xml:space="preserve">Merge using </w:t>
+      </w:r>
+      <w:proofErr w:type="spellStart"/>
+      <w:r>
+        <w:rPr>
+          <w:bCs/>
+          <w:sz w:val="16"/>
+          <w:szCs w:val="16"/>
+        </w:rPr>
+        <w:t>rbpnet_predict.ipynb</w:t>
+      </w:r>
+      <w:proofErr w:type="spellEnd"/>
+    </w:p>
+    <w:p>
+      <w:pPr>
+        <w:pStyle w:val="ListParagraph"/>
+        <w:numPr>
+          <w:ilvl w:val="0"/>
+          <w:numId w:val="47"/>
+        </w:numPr>
+        <w:spacing w:after="0" w:line="240" w:lineRule="auto"/>
+        <w:rPr>
+          <w:bCs/>
+          <w:sz w:val="16"/>
+          <w:szCs w:val="16"/>
+        </w:rPr>
+      </w:pPr>
+      <w:r>
+        <w:rPr>
+          <w:bCs/>
+          <w:sz w:val="16"/>
+          <w:szCs w:val="16"/>
+        </w:rPr>
+        <w:t xml:space="preserve">Minor intron annotations overlap </w:t>
+      </w:r>
+      <w:r>
+        <w:rPr>
+          <w:bCs/>
+          <w:sz w:val="16"/>
+          <w:szCs w:val="16"/>
+        </w:rPr>
+        <w:t>Users/mikej/Documents/Career/Georges/Ule/intron_retention_propensity/data/IR/Homo_sapiens_intron.csv</w:t>
+      </w:r>
+    </w:p>
+    <w:p>
+      <w:pPr>
+        <w:pStyle w:val="ListParagraph"/>
+        <w:numPr>
+          <w:ilvl w:val="1"/>
+          <w:numId w:val="47"/>
+        </w:numPr>
+        <w:spacing w:after="0" w:line="240" w:lineRule="auto"/>
+        <w:rPr>
+          <w:bCs/>
+          <w:sz w:val="16"/>
+          <w:szCs w:val="16"/>
+        </w:rPr>
+      </w:pPr>
+      <w:r>
+        <w:rPr>
+          <w:bCs/>
+          <w:sz w:val="16"/>
+          <w:szCs w:val="16"/>
+        </w:rPr>
+        <w:t xml:space="preserve">Merge with </w:t>
+      </w:r>
+      <w:proofErr w:type="spellStart"/>
+      <w:r>
+        <w:rPr>
+          <w:bCs/>
+          <w:sz w:val="16"/>
+          <w:szCs w:val="16"/>
+        </w:rPr>
+        <w:t>AnnotationsExplorationMinorSplice.Rmd</w:t>
+      </w:r>
+      <w:proofErr w:type="spellEnd"/>
+    </w:p>
+    <w:p>
+      <w:pPr>
+        <w:pStyle w:val="ListParagraph"/>
+        <w:numPr>
+          <w:ilvl w:val="0"/>
+          <w:numId w:val="47"/>
+        </w:numPr>
+        <w:spacing w:after="0" w:line="240" w:lineRule="auto"/>
+        <w:rPr>
+          <w:bCs/>
+          <w:sz w:val="16"/>
+          <w:szCs w:val="16"/>
+        </w:rPr>
+      </w:pPr>
+      <w:r>
+        <w:rPr>
+          <w:bCs/>
+          <w:sz w:val="16"/>
+          <w:szCs w:val="16"/>
+        </w:rPr>
+        <w:t xml:space="preserve">Transposable elements overlap </w:t>
+      </w:r>
+      <w:r>
+        <w:rPr>
+          <w:bCs/>
+          <w:sz w:val="16"/>
+          <w:szCs w:val="16"/>
+        </w:rPr>
+        <w:t>/Users/mikej/Documents/Career/Georges/Ule/intron_retention_propensity/data/IR/hg38.fa.out.gz</w:t>
+      </w:r>
+    </w:p>
+    <w:p>
+      <w:pPr>
+        <w:pStyle w:val="ListParagraph"/>
+        <w:numPr>
+          <w:ilvl w:val="1"/>
+          <w:numId w:val="47"/>
+        </w:numPr>
+        <w:spacing w:after="0" w:line="240" w:lineRule="auto"/>
+        <w:rPr>
+          <w:bCs/>
+          <w:sz w:val="16"/>
+          <w:szCs w:val="16"/>
+        </w:rPr>
+      </w:pPr>
+      <w:r>
+        <w:rPr>
+          <w:bCs/>
+          <w:sz w:val="16"/>
+          <w:szCs w:val="16"/>
+        </w:rPr>
+        <w:t>Merge with AnnotationsPart2transposon.Rmd</w:t>
+      </w:r>
+    </w:p>
+    <w:p>
+      <w:pPr>
+        <w:pStyle w:val="ListParagraph"/>
+        <w:numPr>
+          <w:ilvl w:val="0"/>
+          <w:numId w:val="47"/>
+        </w:numPr>
+        <w:spacing w:after="0" w:line="240" w:lineRule="auto"/>
+        <w:rPr>
+          <w:bCs/>
+          <w:sz w:val="16"/>
+          <w:szCs w:val="16"/>
+        </w:rPr>
+      </w:pPr>
+      <w:r>
+        <w:rPr>
+          <w:bCs/>
+          <w:sz w:val="16"/>
+          <w:szCs w:val="16"/>
+        </w:rPr>
+        <w:t>Decoy splice sites and splice sites only predictions</w:t>
+      </w:r>
+    </w:p>
+    <w:p>
+      <w:pPr>
+        <w:pStyle w:val="ListParagraph"/>
+        <w:numPr>
+          <w:ilvl w:val="1"/>
+          <w:numId w:val="47"/>
+        </w:numPr>
+        <w:spacing w:after="0" w:line="240" w:lineRule="auto"/>
+        <w:rPr>
+          <w:bCs/>
+          <w:sz w:val="16"/>
+          <w:szCs w:val="16"/>
+        </w:rPr>
+      </w:pPr>
+      <w:r>
+        <w:rPr>
+          <w:bCs/>
+          <w:sz w:val="16"/>
+          <w:szCs w:val="16"/>
+        </w:rPr>
+        <w:t>Merged using AnnotationsPart3StatisticsandRegression.Rmd</w:t>
+      </w:r>
     </w:p>
     <w:sectPr>
       <w:pgSz w:w="12240" w:h="15840"/>
@@ -38179,7 +40317,7 @@
   <w:abstractNum w:abstractNumId="22" w15:restartNumberingAfterBreak="0">
     <w:nsid w:val="42C66C4E"/>
     <w:multiLevelType w:val="hybridMultilevel"/>
-    <w:tmpl w:val="AC34B892"/>
+    <w:tmpl w:val="A15E2598"/>
     <w:lvl w:ilvl="0" w:tplc="0809000F">
       <w:start w:val="1"/>
       <w:numFmt w:val="decimal"/>
@@ -38240,14 +40378,16 @@
         <w:rFonts w:hint="default"/>
       </w:rPr>
     </w:lvl>
-    <w:lvl w:ilvl="6" w:tplc="0809000F" w:tentative="1">
-      <w:start w:val="1"/>
-      <w:numFmt w:val="decimal"/>
-      <w:lvlText w:val="%7."/>
+    <w:lvl w:ilvl="6" w:tplc="846CADCC">
+      <w:numFmt w:val="bullet"/>
+      <w:lvlText w:val="-"/>
       <w:lvlJc w:val="left"/>
       <w:pPr>
         <w:ind w:left="5040" w:hanging="360"/>
       </w:pPr>
+      <w:rPr>
+        <w:rFonts w:ascii="Aptos" w:eastAsiaTheme="minorHAnsi" w:hAnsi="Aptos" w:cstheme="minorBidi" w:hint="default"/>
+      </w:rPr>
     </w:lvl>
     <w:lvl w:ilvl="7" w:tplc="08090019" w:tentative="1">
       <w:start w:val="1"/>
@@ -39671,6 +41811,95 @@
     </w:lvl>
   </w:abstractNum>
   <w:abstractNum w:abstractNumId="37" w15:restartNumberingAfterBreak="0">
+    <w:nsid w:val="6B1F4224"/>
+    <w:multiLevelType w:val="hybridMultilevel"/>
+    <w:tmpl w:val="05060FBC"/>
+    <w:lvl w:ilvl="0" w:tplc="0809000F">
+      <w:start w:val="1"/>
+      <w:numFmt w:val="decimal"/>
+      <w:lvlText w:val="%1."/>
+      <w:lvlJc w:val="left"/>
+      <w:pPr>
+        <w:ind w:left="720" w:hanging="360"/>
+      </w:pPr>
+      <w:rPr>
+        <w:rFonts w:hint="default"/>
+      </w:rPr>
+    </w:lvl>
+    <w:lvl w:ilvl="1" w:tplc="08090019">
+      <w:start w:val="1"/>
+      <w:numFmt w:val="lowerLetter"/>
+      <w:lvlText w:val="%2."/>
+      <w:lvlJc w:val="left"/>
+      <w:pPr>
+        <w:ind w:left="1440" w:hanging="360"/>
+      </w:pPr>
+    </w:lvl>
+    <w:lvl w:ilvl="2" w:tplc="0809001B" w:tentative="1">
+      <w:start w:val="1"/>
+      <w:numFmt w:val="lowerRoman"/>
+      <w:lvlText w:val="%3."/>
+      <w:lvlJc w:val="right"/>
+      <w:pPr>
+        <w:ind w:left="2160" w:hanging="180"/>
+      </w:pPr>
+    </w:lvl>
+    <w:lvl w:ilvl="3" w:tplc="0809000F" w:tentative="1">
+      <w:start w:val="1"/>
+      <w:numFmt w:val="decimal"/>
+      <w:lvlText w:val="%4."/>
+      <w:lvlJc w:val="left"/>
+      <w:pPr>
+        <w:ind w:left="2880" w:hanging="360"/>
+      </w:pPr>
+    </w:lvl>
+    <w:lvl w:ilvl="4" w:tplc="08090019" w:tentative="1">
+      <w:start w:val="1"/>
+      <w:numFmt w:val="lowerLetter"/>
+      <w:lvlText w:val="%5."/>
+      <w:lvlJc w:val="left"/>
+      <w:pPr>
+        <w:ind w:left="3600" w:hanging="360"/>
+      </w:pPr>
+    </w:lvl>
+    <w:lvl w:ilvl="5" w:tplc="0809001B" w:tentative="1">
+      <w:start w:val="1"/>
+      <w:numFmt w:val="lowerRoman"/>
+      <w:lvlText w:val="%6."/>
+      <w:lvlJc w:val="right"/>
+      <w:pPr>
+        <w:ind w:left="4320" w:hanging="180"/>
+      </w:pPr>
+    </w:lvl>
+    <w:lvl w:ilvl="6" w:tplc="0809000F" w:tentative="1">
+      <w:start w:val="1"/>
+      <w:numFmt w:val="decimal"/>
+      <w:lvlText w:val="%7."/>
+      <w:lvlJc w:val="left"/>
+      <w:pPr>
+        <w:ind w:left="5040" w:hanging="360"/>
+      </w:pPr>
+    </w:lvl>
+    <w:lvl w:ilvl="7" w:tplc="08090019" w:tentative="1">
+      <w:start w:val="1"/>
+      <w:numFmt w:val="lowerLetter"/>
+      <w:lvlText w:val="%8."/>
+      <w:lvlJc w:val="left"/>
+      <w:pPr>
+        <w:ind w:left="5760" w:hanging="360"/>
+      </w:pPr>
+    </w:lvl>
+    <w:lvl w:ilvl="8" w:tplc="0809001B" w:tentative="1">
+      <w:start w:val="1"/>
+      <w:numFmt w:val="lowerRoman"/>
+      <w:lvlText w:val="%9."/>
+      <w:lvlJc w:val="right"/>
+      <w:pPr>
+        <w:ind w:left="6480" w:hanging="180"/>
+      </w:pPr>
+    </w:lvl>
+  </w:abstractNum>
+  <w:abstractNum w:abstractNumId="38" w15:restartNumberingAfterBreak="0">
     <w:nsid w:val="6BE51082"/>
     <w:multiLevelType w:val="hybridMultilevel"/>
     <w:tmpl w:val="C5B2F3F8"/>
@@ -39759,7 +41988,7 @@
       </w:pPr>
     </w:lvl>
   </w:abstractNum>
-  <w:abstractNum w:abstractNumId="38" w15:restartNumberingAfterBreak="0">
+  <w:abstractNum w:abstractNumId="39" w15:restartNumberingAfterBreak="0">
     <w:nsid w:val="71A16D8D"/>
     <w:multiLevelType w:val="hybridMultilevel"/>
     <w:tmpl w:val="B9EE8B50"/>
@@ -39848,7 +42077,7 @@
       </w:pPr>
     </w:lvl>
   </w:abstractNum>
-  <w:abstractNum w:abstractNumId="39" w15:restartNumberingAfterBreak="0">
+  <w:abstractNum w:abstractNumId="40" w15:restartNumberingAfterBreak="0">
     <w:nsid w:val="7346094F"/>
     <w:multiLevelType w:val="hybridMultilevel"/>
     <w:tmpl w:val="F71ECE06"/>
@@ -39937,7 +42166,7 @@
       </w:pPr>
     </w:lvl>
   </w:abstractNum>
-  <w:abstractNum w:abstractNumId="40" w15:restartNumberingAfterBreak="0">
+  <w:abstractNum w:abstractNumId="41" w15:restartNumberingAfterBreak="0">
     <w:nsid w:val="741776A2"/>
     <w:multiLevelType w:val="hybridMultilevel"/>
     <w:tmpl w:val="6A7692FE"/>
@@ -40026,7 +42255,7 @@
       </w:pPr>
     </w:lvl>
   </w:abstractNum>
-  <w:abstractNum w:abstractNumId="41" w15:restartNumberingAfterBreak="0">
+  <w:abstractNum w:abstractNumId="42" w15:restartNumberingAfterBreak="0">
     <w:nsid w:val="7629584D"/>
     <w:multiLevelType w:val="hybridMultilevel"/>
     <w:tmpl w:val="5CA6B9BC"/>
@@ -40115,7 +42344,7 @@
       </w:pPr>
     </w:lvl>
   </w:abstractNum>
-  <w:abstractNum w:abstractNumId="42" w15:restartNumberingAfterBreak="0">
+  <w:abstractNum w:abstractNumId="43" w15:restartNumberingAfterBreak="0">
     <w:nsid w:val="7BD02D13"/>
     <w:multiLevelType w:val="hybridMultilevel"/>
     <w:tmpl w:val="DEE22EB2"/>
@@ -40204,7 +42433,7 @@
       </w:pPr>
     </w:lvl>
   </w:abstractNum>
-  <w:abstractNum w:abstractNumId="43" w15:restartNumberingAfterBreak="0">
+  <w:abstractNum w:abstractNumId="44" w15:restartNumberingAfterBreak="0">
     <w:nsid w:val="7BDE4B83"/>
     <w:multiLevelType w:val="hybridMultilevel"/>
     <w:tmpl w:val="5F6626AA"/>
@@ -40317,7 +42546,7 @@
       </w:rPr>
     </w:lvl>
   </w:abstractNum>
-  <w:abstractNum w:abstractNumId="44" w15:restartNumberingAfterBreak="0">
+  <w:abstractNum w:abstractNumId="45" w15:restartNumberingAfterBreak="0">
     <w:nsid w:val="7D29532D"/>
     <w:multiLevelType w:val="hybridMultilevel"/>
     <w:tmpl w:val="FD74FA54"/>
@@ -40406,7 +42635,7 @@
       </w:pPr>
     </w:lvl>
   </w:abstractNum>
-  <w:abstractNum w:abstractNumId="45" w15:restartNumberingAfterBreak="0">
+  <w:abstractNum w:abstractNumId="46" w15:restartNumberingAfterBreak="0">
     <w:nsid w:val="7FCC0842"/>
     <w:multiLevelType w:val="hybridMultilevel"/>
     <w:tmpl w:val="0F1C0BAE"/>
@@ -40544,13 +42773,13 @@
     <w:abstractNumId w:val="32"/>
   </w:num>
   <w:num w:numId="9" w16cid:durableId="1956327987">
-    <w:abstractNumId w:val="44"/>
+    <w:abstractNumId w:val="45"/>
   </w:num>
   <w:num w:numId="10" w16cid:durableId="358744074">
-    <w:abstractNumId w:val="40"/>
+    <w:abstractNumId w:val="41"/>
   </w:num>
   <w:num w:numId="11" w16cid:durableId="212468574">
-    <w:abstractNumId w:val="42"/>
+    <w:abstractNumId w:val="43"/>
   </w:num>
   <w:num w:numId="12" w16cid:durableId="289629011">
     <w:abstractNumId w:val="36"/>
@@ -40562,10 +42791,10 @@
     <w:abstractNumId w:val="20"/>
   </w:num>
   <w:num w:numId="15" w16cid:durableId="1620457220">
-    <w:abstractNumId w:val="38"/>
+    <w:abstractNumId w:val="39"/>
   </w:num>
   <w:num w:numId="16" w16cid:durableId="423458569">
-    <w:abstractNumId w:val="37"/>
+    <w:abstractNumId w:val="38"/>
   </w:num>
   <w:num w:numId="17" w16cid:durableId="1356923182">
     <w:abstractNumId w:val="12"/>
@@ -40589,7 +42818,7 @@
     <w:abstractNumId w:val="27"/>
   </w:num>
   <w:num w:numId="24" w16cid:durableId="1413969223">
-    <w:abstractNumId w:val="39"/>
+    <w:abstractNumId w:val="40"/>
   </w:num>
   <w:num w:numId="25" w16cid:durableId="29452235">
     <w:abstractNumId w:val="3"/>
@@ -40625,10 +42854,10 @@
     <w:abstractNumId w:val="0"/>
   </w:num>
   <w:num w:numId="36" w16cid:durableId="1797407469">
-    <w:abstractNumId w:val="41"/>
+    <w:abstractNumId w:val="42"/>
   </w:num>
   <w:num w:numId="37" w16cid:durableId="1205172044">
-    <w:abstractNumId w:val="43"/>
+    <w:abstractNumId w:val="44"/>
   </w:num>
   <w:num w:numId="38" w16cid:durableId="2078478872">
     <w:abstractNumId w:val="29"/>
@@ -40655,7 +42884,10 @@
     <w:abstractNumId w:val="1"/>
   </w:num>
   <w:num w:numId="46" w16cid:durableId="1418090551">
-    <w:abstractNumId w:val="45"/>
+    <w:abstractNumId w:val="46"/>
+  </w:num>
+  <w:num w:numId="47" w16cid:durableId="338892290">
+    <w:abstractNumId w:val="37"/>
   </w:num>
 </w:numbering>
 </file>
@@ -41060,7 +43292,7 @@
   <w:style w:type="paragraph" w:default="1" w:styleId="Normal">
     <w:name w:val="Normal"/>
     <w:qFormat/>
-    <w:rsid w:val="00680A07"/>
+    <w:rsid w:val="00A17E34"/>
   </w:style>
   <w:style w:type="paragraph" w:styleId="Heading1">
     <w:name w:val="heading 1"/>

</xml_diff>